<commit_message>
docs: update project report for A* planner; add SOTA comparison, roadmap and compute profile
- Report: A* planner section, PRM vs A* comparison table, new lessons, updated
  test counts, conclusion/future work and references.
- New docs/work-docs/nav/sota_comparison_and_roadmap.md: comparison with
  published systems, remaining work, measured planner timings (A* ~64 ms vs
  PRM ~1.05 s on the tunnel fixture).
- step07 and resource README: compute note and Theta* -> A* note.
</commit_message>
<xml_diff>
--- a/media/reports/TerraLink_Project_Report.docx
+++ b/media/reports/TerraLink_Project_Report.docx
@@ -71,7 +71,7 @@
           <w:rFonts w:ascii="Times New Roman" w:hAnsi="Times New Roman"/>
           <w:sz w:val="18"/>
         </w:rPr>
-        <w:t>Autonomous navigation across unstructured, occluded environments—such as collapsed structures, subterranean passages, and dense construction sites—demands heterogeneous robotic cooperation. While unmanned aerial vehicles (UAVs) provide rapid global overhead surveillance, ground robots (UGVs) execute physical transport and inspection. However, conventional 2.5D elevation grids fail catastrophically under semi-enclosed structures: overhead depth sensors capture ceiling or overhang returns, collapsing vertical traversability into lethal obstacle steps and starving ground planners of viable routes. In this work, we present TerraLink, a complete, from-scratch ROS 2 Humble framework designed for Ignition Gazebo Fortress. TerraLink couples a high-throughput 2.5D GPU/CPU elevation mapping engine (emap) with an anomaly-guided bounded 3D volumetric verifier (nav). We introduce a topological connected-component anomaly detector (Version 3) that isolates genuine overhang signatures from planar partition walls via elevation differentials. When potential occlusions are detected, a hierarchical Probabilistic Roadmap (PRM) routes a tentative path charged with an anomaly cost penalty (20×). Ground truth vertical clearance is verified on-the-fly through an in-process octree (BoundedVoxelMap) with radial spatial eviction (12m radius). Verified headroom verdicts are persistently retained in a bidirectional memory loop (ResolvedRegionStore) to eliminate query oscillations. The system has been validated across 176 automated unit tests and extensive simulation benchmarks in Ignition Fortress. The UGV autonomously negotiates an occluded tunnel corridor, achieving complete transit in 133–153s with zero operator intervention. Furthermore, we document the critical physical, simulation, and coordination defects encountered during development and provide the exact mathematical and algorithmic solutions that ensured end-to-end stability.</w:t>
+        <w:t>Autonomous navigation across unstructured, occluded environments—such as collapsed structures, subterranean passages, and dense construction sites—demands heterogeneous robotic cooperation. While unmanned aerial vehicles (UAVs) provide rapid global overhead surveillance, ground robots (UGVs) execute physical transport and inspection. However, conventional 2.5D elevation grids fail catastrophically under semi-enclosed structures: overhead depth sensors capture ceiling or overhang returns, collapsing vertical traversability into lethal obstacle steps and starving ground planners of viable routes. In this work, we present TerraLink, a complete, from-scratch ROS 2 Humble framework designed for Ignition Gazebo Fortress. TerraLink couples a high-throughput 2.5D GPU/CPU elevation mapping engine (emap) with an anomaly-guided bounded 3D volumetric verifier (nav). We introduce a topological connected-component anomaly detector (Version 3) that isolates genuine overhang signatures from planar partition walls via elevation differentials. When potential occlusions are detected, a hierarchical Probabilistic Roadmap (PRM) routes a tentative path charged with an anomaly cost penalty (20×). Ground truth vertical clearance is verified on-the-fly through an in-process octree (BoundedVoxelMap) with radial spatial eviction (12m radius). Verified headroom verdicts are persistently retained in a bidirectional memory loop (ResolvedRegionStore) to eliminate query oscillations. A deterministic, opt-in A* grid planner with explicit free/blocked/uncertain cell classes, route memory and a replay-based test workflow was added as a second global planner; in the tunnel world it reached the goal about 16 s after first movement versus about 28 s for PRM (three runs each, simulation only, one world). The system has been validated across 412 automated unit tests (368 nav, 44 emap) and simulation benchmarks in Ignition Fortress. The UGV autonomously negotiates an occluded tunnel corridor with zero operator intervention. Furthermore, we document the critical physical, simulation, and coordination defects encountered during development and provide the exact mathematical and algorithmic solutions that ensured end-to-end stability.</w:t>
       </w:r>
     </w:p>
     <w:p>
@@ -94,7 +94,7 @@
           <w:i/>
           <w:sz w:val="18"/>
         </w:rPr>
-        <w:t>Heterogeneous Robotics, UAV-UGV Collaboration, 2.5D Elevation Mapping, OctoMap, PRM Path Planning, Nav2, Anomaly Detection.</w:t>
+        <w:t>Heterogeneous Robotics, UAV-UGV Collaboration, 2.5D Elevation Mapping, OctoMap, PRM and A* Path Planning, Nav2, Anomaly Detection.</w:t>
       </w:r>
     </w:p>
     <w:p>
@@ -208,6 +208,8 @@
         <w:t>4) A bidirectional memory loop (nav.resolved_regions) that caches verified volumetric verdicts to guarantee planner convergence without query oscillation or redundant inspections.</w:t>
         <w:br/>
         <w:t>5) Exhaustive empirical verification in simulation, identifying and correcting five subtle physics, timing, and behavioral failure modes.</w:t>
+        <w:br/>
+        <w:t>6) An opt-in deterministic A* global planner (nav.astar_planner, nav.global_planner) that treats suspected passages and unobserved space as explicit uncertain cell classes, with route memory, exploration and stuck feedback, plus an offline map-replay workflow that tests planning without re-running the UAV scan.</w:t>
       </w:r>
     </w:p>
     <w:p>
@@ -1080,7 +1082,7 @@
           <w:color w:val="0F2942"/>
           <w:sz w:val="21"/>
         </w:rPr>
-        <w:t>VI. HIERARCHICAL PRM PLANNING &amp; MOTION CONTROL</w:t>
+        <w:t>VI. GLOBAL PLANNING (PRM AND A*) &amp; MOTION CONTROL</w:t>
       </w:r>
     </w:p>
     <w:p>
@@ -1142,7 +1144,84 @@
           <w:color w:val="1F3A52"/>
           <w:sz w:val="19"/>
         </w:rPr>
-        <w:t>B. Motion Execution &amp; Preemption Race Prevention</w:t>
+        <w:t>B. Deterministic A* Planner (opt-in, planner_type:=astar)</w:t>
+      </w:r>
+    </w:p>
+    <w:p>
+      <w:pPr>
+        <w:spacing w:after="70" w:line="269" w:lineRule="auto"/>
+        <w:jc w:val="both"/>
+      </w:pPr>
+      <w:r>
+        <w:rPr>
+          <w:rFonts w:ascii="Times New Roman" w:hAnsi="Times New Roman"/>
+          <w:color w:val="1E293B"/>
+          <w:sz w:val="19"/>
+        </w:rPr>
+        <w:t>Random sampling can miss a 1 m tunnel and gives different routes for nearly identical maps. The A* planner (nav.astar_planner) searches an 8-connected cost grid with an octile heuristic, no diagonal corner cutting and a deterministic tie-break, so equal maps give equal paths and a path is found whenever one exists at grid resolution. Obstacles are inflated by robot radius plus margin, minus a 0.1 m rim already contained in emap's lethal mask. Cells are free, blocked or uncertain (suspected passage from nav.anomaly, or unobserved space next to free ground). Search runs in passes so a confirmed route always beats a guess: strict (free cells only), then optimistic (uncertain cells added with a penalty), each at full then relaxed inflation. Paths are shortened by supercover line of sight, cost-aware on free ground, and a standoff waypoint is placed 1 m before an uncertain stretch where the UGV should stop and look.</w:t>
+      </w:r>
+    </w:p>
+    <w:p>
+      <w:pPr>
+        <w:spacing w:after="70" w:line="269" w:lineRule="auto"/>
+        <w:jc w:val="both"/>
+      </w:pPr>
+      <w:r>
+        <w:rPr>
+          <w:rFonts w:ascii="Times New Roman" w:hAnsi="Times New Roman"/>
+          <w:b/>
+          <w:color w:val="1E293B"/>
+          <w:sz w:val="19"/>
+        </w:rPr>
+        <w:t xml:space="preserve">Decisions around the planner: </w:t>
+      </w:r>
+      <w:r>
+        <w:rPr>
+          <w:rFonts w:ascii="Times New Roman" w:hAnsi="Times New Roman"/>
+          <w:color w:val="1E293B"/>
+          <w:sz w:val="19"/>
+        </w:rPr>
+        <w:t>A shared decision layer (nav.global_planner) adds route memory (a stored route is kept unless it became invalid, a confirmed route replaced a tentative one, or a new route is at least 15% cheaper), exploration toward suspected passages and then frontier viewpoints, an anomaly hold against detector flicker, a wait-for-mapping gate, and stuck feedback that penalizes the route stretch ahead of a stalled robot. All of these are off by default except route memory. The same class is used by the ROS node and by the offline replay tool, so offline results reflect the live planner.</w:t>
+      </w:r>
+    </w:p>
+    <w:p>
+      <w:pPr>
+        <w:spacing w:after="70" w:line="269" w:lineRule="auto"/>
+        <w:jc w:val="both"/>
+      </w:pPr>
+      <w:r>
+        <w:rPr>
+          <w:rFonts w:ascii="Times New Roman" w:hAnsi="Times New Roman"/>
+          <w:b/>
+          <w:color w:val="1E293B"/>
+          <w:sz w:val="19"/>
+        </w:rPr>
+        <w:t xml:space="preserve">Lessons from real maps: </w:t>
+      </w:r>
+      <w:r>
+        <w:rPr>
+          <w:rFonts w:ascii="Times New Roman" w:hAnsi="Times New Roman"/>
+          <w:color w:val="1E293B"/>
+          <w:sz w:val="19"/>
+        </w:rPr>
+        <w:t>A real finding: a 0.15 m wall is only one or two 0.1 m cells wide, so part of it is unobserved rather than lethal and appears as a thin frontier line. Both planners treated it as a possible passage and repeatedly drove at the wall. Dropping unobserved strips thinner than the robot diameter (frontier_min_width_m = 0.44 m, automatic for A*) removed this; without it A* reached the goal in 0 of 3 runs. A second finding concerned clearance: the live detector flags only about 3x3 cells at each tunnel mouth, narrower than the robot, so demanding full clearance there returned no path where PRM's zero-width line of sight succeeded; uncertain cells are therefore exempt from the clearance test in the optimistic pass (uncertain_waive_m = 0.5 m).</w:t>
+      </w:r>
+    </w:p>
+    <w:p>
+      <w:pPr>
+        <w:keepNext/>
+        <w:spacing w:before="120" w:after="40"/>
+        <w:jc w:val="left"/>
+      </w:pPr>
+      <w:r>
+        <w:rPr>
+          <w:rFonts w:ascii="Times New Roman" w:hAnsi="Times New Roman"/>
+          <w:b/>
+          <w:i/>
+          <w:color w:val="1F3A52"/>
+          <w:sz w:val="19"/>
+        </w:rPr>
+        <w:t>C. Motion Execution &amp; Preemption Race Prevention</w:t>
       </w:r>
     </w:p>
     <w:p>
@@ -1179,7 +1258,7 @@
           <w:color w:val="1E293B"/>
           <w:sz w:val="19"/>
         </w:rPr>
-        <w:t>Supervisory Watchdog: To handle Nav2 controller exhaustion near physical walls ('Controller patience exceeded'), waypoint_follower incorporates a progress watchdog (_made_progress). If spatial displacement Δd &lt; 0.15m over 20s, stuck recovery resets goal tracking and requests an immediate fresh plan.</w:t>
+        <w:t>Supervisory Watchdog: To handle Nav2 controller exhaustion near physical walls ('Controller patience exceeded'), waypoint_follower incorporates a progress watchdog (_made_progress). If spatial displacement Δd &lt; 0.15m over 20s, stuck recovery resets goal tracking and requests an immediate fresh plan. With a deterministic planner the fresh plan can be identical, which the follower used to treat as no change, so a goal dropped while Nav2 was still starting was never resent; stuck recovery now resends the current goal when the plan is unchanged.</w:t>
       </w:r>
     </w:p>
     <w:p>
@@ -1764,6 +1843,182 @@
                 <w:sz w:val="16"/>
               </w:rPr>
               <w:t>20.0× Distance Weight</w:t>
+            </w:r>
+          </w:p>
+        </w:tc>
+      </w:tr>
+      <w:tr>
+        <w:tc>
+          <w:tcPr>
+            <w:tcW w:type="dxa" w:w="3360"/>
+          </w:tcPr>
+          <w:p>
+            <w:r>
+              <w:rPr>
+                <w:sz w:val="16"/>
+              </w:rPr>
+              <w:t>nav.astar_planner</w:t>
+            </w:r>
+          </w:p>
+        </w:tc>
+        <w:tc>
+          <w:tcPr>
+            <w:tcW w:type="dxa" w:w="3360"/>
+          </w:tcPr>
+          <w:p>
+            <w:r>
+              <w:rPr>
+                <w:sz w:val="16"/>
+              </w:rPr>
+              <w:t>Robot radius / Margin / Mask rim</w:t>
+            </w:r>
+          </w:p>
+        </w:tc>
+        <w:tc>
+          <w:tcPr>
+            <w:tcW w:type="dxa" w:w="3360"/>
+          </w:tcPr>
+          <w:p>
+            <w:pPr>
+              <w:jc w:val="center"/>
+            </w:pPr>
+            <w:r>
+              <w:rPr>
+                <w:sz w:val="16"/>
+              </w:rPr>
+              <w:t>0.22 m / 0.05 m / 0.10 m</w:t>
+            </w:r>
+          </w:p>
+        </w:tc>
+      </w:tr>
+      <w:tr>
+        <w:tc>
+          <w:tcPr>
+            <w:tcW w:type="dxa" w:w="3360"/>
+          </w:tcPr>
+          <w:p>
+            <w:r>
+              <w:rPr>
+                <w:sz w:val="16"/>
+              </w:rPr>
+              <w:t>nav.astar_planner</w:t>
+            </w:r>
+          </w:p>
+        </w:tc>
+        <w:tc>
+          <w:tcPr>
+            <w:tcW w:type="dxa" w:w="3360"/>
+          </w:tcPr>
+          <w:p>
+            <w:r>
+              <w:rPr>
+                <w:sz w:val="16"/>
+              </w:rPr>
+              <w:t>Standoff / Uncertain waiver</w:t>
+            </w:r>
+          </w:p>
+        </w:tc>
+        <w:tc>
+          <w:tcPr>
+            <w:tcW w:type="dxa" w:w="3360"/>
+          </w:tcPr>
+          <w:p>
+            <w:pPr>
+              <w:jc w:val="center"/>
+            </w:pPr>
+            <w:r>
+              <w:rPr>
+                <w:sz w:val="16"/>
+              </w:rPr>
+              <w:t>1.0 m / 0.5 m (optimistic pass)</w:t>
+            </w:r>
+          </w:p>
+        </w:tc>
+      </w:tr>
+      <w:tr>
+        <w:tc>
+          <w:tcPr>
+            <w:tcW w:type="dxa" w:w="3360"/>
+          </w:tcPr>
+          <w:p>
+            <w:r>
+              <w:rPr>
+                <w:sz w:val="16"/>
+              </w:rPr>
+              <w:t>nav.global_planner</w:t>
+            </w:r>
+          </w:p>
+        </w:tc>
+        <w:tc>
+          <w:tcPr>
+            <w:tcW w:type="dxa" w:w="3360"/>
+          </w:tcPr>
+          <w:p>
+            <w:r>
+              <w:rPr>
+                <w:sz w:val="16"/>
+              </w:rPr>
+              <w:t>Plan switch margin / Stuck window</w:t>
+            </w:r>
+          </w:p>
+        </w:tc>
+        <w:tc>
+          <w:tcPr>
+            <w:tcW w:type="dxa" w:w="3360"/>
+          </w:tcPr>
+          <w:p>
+            <w:pPr>
+              <w:jc w:val="center"/>
+            </w:pPr>
+            <w:r>
+              <w:rPr>
+                <w:sz w:val="16"/>
+              </w:rPr>
+              <w:t>15% cost / 18 s</w:t>
+            </w:r>
+          </w:p>
+        </w:tc>
+      </w:tr>
+      <w:tr>
+        <w:tc>
+          <w:tcPr>
+            <w:tcW w:type="dxa" w:w="3360"/>
+          </w:tcPr>
+          <w:p>
+            <w:r>
+              <w:rPr>
+                <w:sz w:val="16"/>
+              </w:rPr>
+              <w:t>nav.walkability</w:t>
+            </w:r>
+          </w:p>
+        </w:tc>
+        <w:tc>
+          <w:tcPr>
+            <w:tcW w:type="dxa" w:w="3360"/>
+          </w:tcPr>
+          <w:p>
+            <w:r>
+              <w:rPr>
+                <w:sz w:val="16"/>
+              </w:rPr>
+              <w:t>Frontier min width (A* auto)</w:t>
+            </w:r>
+          </w:p>
+        </w:tc>
+        <w:tc>
+          <w:tcPr>
+            <w:tcW w:type="dxa" w:w="3360"/>
+          </w:tcPr>
+          <w:p>
+            <w:pPr>
+              <w:jc w:val="center"/>
+            </w:pPr>
+            <w:r>
+              <w:rPr>
+                <w:sz w:val="16"/>
+              </w:rPr>
+              <w:t>0.44 m (robot diameter)</w:t>
             </w:r>
           </w:p>
         </w:tc>
@@ -2522,7 +2777,7 @@
           <w:color w:val="1F3A52"/>
           <w:sz w:val="19"/>
         </w:rPr>
-        <w:t>C. Test Suite Verification</w:t>
+        <w:t>C. Planner Comparison: PRM versus A*</w:t>
       </w:r>
     </w:p>
     <w:p>
@@ -2536,7 +2791,775 @@
           <w:color w:val="1E293B"/>
           <w:sz w:val="19"/>
         </w:rPr>
-        <w:t>To enforce architectural integrity without simulator overhead, the repository contains 13 dedicated test suites spanning tests/emap and tests/nav. All 176 automated unit tests execute in 6.73s, confirming coordinate math, Bayesian fusion invariants, Mahalanobis rejection, Bresenham rasterization, OctoMap eviction, and Dijkstra cost weights in pure Python/NumPy isolation.</w:t>
+        <w:t>Both planners were run in tunnel_test.world with goal (3, 0), a 6.0 m straight-line start-to-goal distance, headless, using the ground-truth odometry topic. Move-to-arrive is the time from first movement to within 0.3 m of the goal; stalled time counts 5 s windows with under 0.1 m net movement. In start-at-planning mode the UAV scan is skipped and the saved finished map is replayed, which isolates planning and following from scan timing (three runs per configuration). Table III summarises it; all PRM numbers include the flag and goal-resend fixes described above.</w:t>
+      </w:r>
+    </w:p>
+    <w:p>
+      <w:pPr>
+        <w:spacing w:before="120" w:after="40"/>
+        <w:jc w:val="center"/>
+      </w:pPr>
+      <w:r>
+        <w:rPr>
+          <w:rFonts w:ascii="Times New Roman" w:hAnsi="Times New Roman"/>
+          <w:b/>
+          <w:color w:val="1E293B"/>
+          <w:sz w:val="17"/>
+        </w:rPr>
+        <w:t xml:space="preserve">TABLE III: </w:t>
+      </w:r>
+      <w:r>
+        <w:rPr>
+          <w:rFonts w:ascii="Times New Roman" w:hAnsi="Times New Roman"/>
+          <w:b w:val="0"/>
+          <w:color w:val="1E293B"/>
+          <w:sz w:val="17"/>
+        </w:rPr>
+        <w:t>PRM VERSUS A* IN THE TUNNEL WORLD (SIMULATION, ONE WORLD, ONE GOAL)</w:t>
+      </w:r>
+    </w:p>
+    <w:tbl>
+      <w:tblPr>
+        <w:tblW w:type="auto" w:w="0"/>
+        <w:jc w:val="center"/>
+        <w:tblLook w:firstColumn="1" w:firstRow="1" w:lastColumn="0" w:lastRow="0" w:noHBand="0" w:noVBand="1" w:val="04A0"/>
+        <w:tblBorders>
+          <w:top w:val="single" w:sz="10" w:color="0F2942"/>
+          <w:bottom w:val="single" w:sz="10" w:color="0F2942"/>
+          <w:insideH w:val="single" w:sz="4" w:color="CBD5E1"/>
+          <w:left w:val="none"/>
+          <w:right w:val="none"/>
+          <w:insideV w:val="none"/>
+        </w:tblBorders>
+      </w:tblPr>
+      <w:tblGrid>
+        <w:gridCol w:w="2016"/>
+        <w:gridCol w:w="2016"/>
+        <w:gridCol w:w="2016"/>
+        <w:gridCol w:w="2016"/>
+        <w:gridCol w:w="2016"/>
+      </w:tblGrid>
+      <w:tr>
+        <w:tc>
+          <w:tcPr>
+            <w:tcW w:type="dxa" w:w="2016"/>
+            <w:shd w:val="clear" w:color="auto" w:fill="F1F5F9"/>
+          </w:tcPr>
+          <w:p>
+            <w:pPr>
+              <w:jc w:val="center"/>
+            </w:pPr>
+            <w:r>
+              <w:rPr>
+                <w:b/>
+                <w:sz w:val="17"/>
+              </w:rPr>
+              <w:t>Configuration</w:t>
+            </w:r>
+          </w:p>
+        </w:tc>
+        <w:tc>
+          <w:tcPr>
+            <w:tcW w:type="dxa" w:w="2016"/>
+            <w:shd w:val="clear" w:color="auto" w:fill="F1F5F9"/>
+          </w:tcPr>
+          <w:p>
+            <w:pPr>
+              <w:jc w:val="center"/>
+            </w:pPr>
+            <w:r>
+              <w:rPr>
+                <w:b/>
+                <w:sz w:val="17"/>
+              </w:rPr>
+              <w:t>Runs</w:t>
+            </w:r>
+          </w:p>
+        </w:tc>
+        <w:tc>
+          <w:tcPr>
+            <w:tcW w:type="dxa" w:w="2016"/>
+            <w:shd w:val="clear" w:color="auto" w:fill="F1F5F9"/>
+          </w:tcPr>
+          <w:p>
+            <w:pPr>
+              <w:jc w:val="center"/>
+            </w:pPr>
+            <w:r>
+              <w:rPr>
+                <w:b/>
+                <w:sz w:val="17"/>
+              </w:rPr>
+              <w:t>Reached</w:t>
+            </w:r>
+          </w:p>
+        </w:tc>
+        <w:tc>
+          <w:tcPr>
+            <w:tcW w:type="dxa" w:w="2016"/>
+            <w:shd w:val="clear" w:color="auto" w:fill="F1F5F9"/>
+          </w:tcPr>
+          <w:p>
+            <w:pPr>
+              <w:jc w:val="center"/>
+            </w:pPr>
+            <w:r>
+              <w:rPr>
+                <w:b/>
+                <w:sz w:val="17"/>
+              </w:rPr>
+              <w:t>Move-to-arrive</w:t>
+            </w:r>
+          </w:p>
+        </w:tc>
+        <w:tc>
+          <w:tcPr>
+            <w:tcW w:type="dxa" w:w="2016"/>
+            <w:shd w:val="clear" w:color="auto" w:fill="F1F5F9"/>
+          </w:tcPr>
+          <w:p>
+            <w:pPr>
+              <w:jc w:val="center"/>
+            </w:pPr>
+            <w:r>
+              <w:rPr>
+                <w:b/>
+                <w:sz w:val="17"/>
+              </w:rPr>
+              <w:t>Driven / stalled</w:t>
+            </w:r>
+          </w:p>
+        </w:tc>
+      </w:tr>
+      <w:tr>
+        <w:tc>
+          <w:tcPr>
+            <w:tcW w:type="dxa" w:w="2016"/>
+          </w:tcPr>
+          <w:p>
+            <w:r>
+              <w:rPr>
+                <w:sz w:val="16"/>
+              </w:rPr>
+              <w:t>Clean map: PRM</w:t>
+            </w:r>
+          </w:p>
+        </w:tc>
+        <w:tc>
+          <w:tcPr>
+            <w:tcW w:type="dxa" w:w="2016"/>
+          </w:tcPr>
+          <w:p>
+            <w:pPr>
+              <w:jc w:val="center"/>
+            </w:pPr>
+            <w:r>
+              <w:rPr>
+                <w:sz w:val="16"/>
+              </w:rPr>
+              <w:t>3</w:t>
+            </w:r>
+          </w:p>
+        </w:tc>
+        <w:tc>
+          <w:tcPr>
+            <w:tcW w:type="dxa" w:w="2016"/>
+          </w:tcPr>
+          <w:p>
+            <w:pPr>
+              <w:jc w:val="center"/>
+            </w:pPr>
+            <w:r>
+              <w:rPr>
+                <w:sz w:val="16"/>
+              </w:rPr>
+              <w:t>3/3</w:t>
+            </w:r>
+          </w:p>
+        </w:tc>
+        <w:tc>
+          <w:tcPr>
+            <w:tcW w:type="dxa" w:w="2016"/>
+          </w:tcPr>
+          <w:p>
+            <w:pPr>
+              <w:jc w:val="center"/>
+            </w:pPr>
+            <w:r>
+              <w:rPr>
+                <w:sz w:val="16"/>
+              </w:rPr>
+              <w:t>28.0 s mean</w:t>
+            </w:r>
+          </w:p>
+        </w:tc>
+        <w:tc>
+          <w:tcPr>
+            <w:tcW w:type="dxa" w:w="2016"/>
+          </w:tcPr>
+          <w:p>
+            <w:pPr>
+              <w:jc w:val="center"/>
+            </w:pPr>
+            <w:r>
+              <w:rPr>
+                <w:sz w:val="16"/>
+              </w:rPr>
+              <w:t>6.5 m / 5 s</w:t>
+            </w:r>
+          </w:p>
+        </w:tc>
+      </w:tr>
+      <w:tr>
+        <w:tc>
+          <w:tcPr>
+            <w:tcW w:type="dxa" w:w="2016"/>
+          </w:tcPr>
+          <w:p>
+            <w:r>
+              <w:rPr>
+                <w:sz w:val="16"/>
+              </w:rPr>
+              <w:t>Clean map: A*, no thin-strip pruning</w:t>
+            </w:r>
+          </w:p>
+        </w:tc>
+        <w:tc>
+          <w:tcPr>
+            <w:tcW w:type="dxa" w:w="2016"/>
+          </w:tcPr>
+          <w:p>
+            <w:pPr>
+              <w:jc w:val="center"/>
+            </w:pPr>
+            <w:r>
+              <w:rPr>
+                <w:sz w:val="16"/>
+              </w:rPr>
+              <w:t>3</w:t>
+            </w:r>
+          </w:p>
+        </w:tc>
+        <w:tc>
+          <w:tcPr>
+            <w:tcW w:type="dxa" w:w="2016"/>
+          </w:tcPr>
+          <w:p>
+            <w:pPr>
+              <w:jc w:val="center"/>
+            </w:pPr>
+            <w:r>
+              <w:rPr>
+                <w:sz w:val="16"/>
+              </w:rPr>
+              <w:t>0/3</w:t>
+            </w:r>
+          </w:p>
+        </w:tc>
+        <w:tc>
+          <w:tcPr>
+            <w:tcW w:type="dxa" w:w="2016"/>
+          </w:tcPr>
+          <w:p>
+            <w:pPr>
+              <w:jc w:val="center"/>
+            </w:pPr>
+            <w:r>
+              <w:rPr>
+                <w:sz w:val="16"/>
+              </w:rPr>
+              <w:t>-</w:t>
+            </w:r>
+          </w:p>
+        </w:tc>
+        <w:tc>
+          <w:tcPr>
+            <w:tcW w:type="dxa" w:w="2016"/>
+          </w:tcPr>
+          <w:p>
+            <w:pPr>
+              <w:jc w:val="center"/>
+            </w:pPr>
+            <w:r>
+              <w:rPr>
+                <w:sz w:val="16"/>
+              </w:rPr>
+              <w:t>3.2-3.9 m / 115-130 s</w:t>
+            </w:r>
+          </w:p>
+        </w:tc>
+      </w:tr>
+      <w:tr>
+        <w:tc>
+          <w:tcPr>
+            <w:tcW w:type="dxa" w:w="2016"/>
+          </w:tcPr>
+          <w:p>
+            <w:r>
+              <w:rPr>
+                <w:sz w:val="16"/>
+              </w:rPr>
+              <w:t>Clean map: A* (defaults)</w:t>
+            </w:r>
+          </w:p>
+        </w:tc>
+        <w:tc>
+          <w:tcPr>
+            <w:tcW w:type="dxa" w:w="2016"/>
+          </w:tcPr>
+          <w:p>
+            <w:pPr>
+              <w:jc w:val="center"/>
+            </w:pPr>
+            <w:r>
+              <w:rPr>
+                <w:sz w:val="16"/>
+              </w:rPr>
+              <w:t>3</w:t>
+            </w:r>
+          </w:p>
+        </w:tc>
+        <w:tc>
+          <w:tcPr>
+            <w:tcW w:type="dxa" w:w="2016"/>
+          </w:tcPr>
+          <w:p>
+            <w:pPr>
+              <w:jc w:val="center"/>
+            </w:pPr>
+            <w:r>
+              <w:rPr>
+                <w:sz w:val="16"/>
+              </w:rPr>
+              <w:t>3/3</w:t>
+            </w:r>
+          </w:p>
+        </w:tc>
+        <w:tc>
+          <w:tcPr>
+            <w:tcW w:type="dxa" w:w="2016"/>
+          </w:tcPr>
+          <w:p>
+            <w:pPr>
+              <w:jc w:val="center"/>
+            </w:pPr>
+            <w:r>
+              <w:rPr>
+                <w:sz w:val="16"/>
+              </w:rPr>
+              <w:t>15.8 s mean</w:t>
+            </w:r>
+          </w:p>
+        </w:tc>
+        <w:tc>
+          <w:tcPr>
+            <w:tcW w:type="dxa" w:w="2016"/>
+          </w:tcPr>
+          <w:p>
+            <w:pPr>
+              <w:jc w:val="center"/>
+            </w:pPr>
+            <w:r>
+              <w:rPr>
+                <w:sz w:val="16"/>
+              </w:rPr>
+              <w:t>5.8 m / 0 s</w:t>
+            </w:r>
+          </w:p>
+        </w:tc>
+      </w:tr>
+      <w:tr>
+        <w:tc>
+          <w:tcPr>
+            <w:tcW w:type="dxa" w:w="2016"/>
+          </w:tcPr>
+          <w:p>
+            <w:r>
+              <w:rPr>
+                <w:sz w:val="16"/>
+              </w:rPr>
+              <w:t>Clean map: A* + exploration + stuck</w:t>
+            </w:r>
+          </w:p>
+        </w:tc>
+        <w:tc>
+          <w:tcPr>
+            <w:tcW w:type="dxa" w:w="2016"/>
+          </w:tcPr>
+          <w:p>
+            <w:pPr>
+              <w:jc w:val="center"/>
+            </w:pPr>
+            <w:r>
+              <w:rPr>
+                <w:sz w:val="16"/>
+              </w:rPr>
+              <w:t>3</w:t>
+            </w:r>
+          </w:p>
+        </w:tc>
+        <w:tc>
+          <w:tcPr>
+            <w:tcW w:type="dxa" w:w="2016"/>
+          </w:tcPr>
+          <w:p>
+            <w:pPr>
+              <w:jc w:val="center"/>
+            </w:pPr>
+            <w:r>
+              <w:rPr>
+                <w:sz w:val="16"/>
+              </w:rPr>
+              <w:t>3/3</w:t>
+            </w:r>
+          </w:p>
+        </w:tc>
+        <w:tc>
+          <w:tcPr>
+            <w:tcW w:type="dxa" w:w="2016"/>
+          </w:tcPr>
+          <w:p>
+            <w:pPr>
+              <w:jc w:val="center"/>
+            </w:pPr>
+            <w:r>
+              <w:rPr>
+                <w:sz w:val="16"/>
+              </w:rPr>
+              <w:t>17.5 s mean</w:t>
+            </w:r>
+          </w:p>
+        </w:tc>
+        <w:tc>
+          <w:tcPr>
+            <w:tcW w:type="dxa" w:w="2016"/>
+          </w:tcPr>
+          <w:p>
+            <w:pPr>
+              <w:jc w:val="center"/>
+            </w:pPr>
+            <w:r>
+              <w:rPr>
+                <w:sz w:val="16"/>
+              </w:rPr>
+              <w:t>5.8-6.5 m / 0 s</w:t>
+            </w:r>
+          </w:p>
+        </w:tc>
+      </w:tr>
+      <w:tr>
+        <w:tc>
+          <w:tcPr>
+            <w:tcW w:type="dxa" w:w="2016"/>
+          </w:tcPr>
+          <w:p>
+            <w:r>
+              <w:rPr>
+                <w:sz w:val="16"/>
+              </w:rPr>
+              <w:t>Full run: PRM</w:t>
+            </w:r>
+          </w:p>
+        </w:tc>
+        <w:tc>
+          <w:tcPr>
+            <w:tcW w:type="dxa" w:w="2016"/>
+          </w:tcPr>
+          <w:p>
+            <w:pPr>
+              <w:jc w:val="center"/>
+            </w:pPr>
+            <w:r>
+              <w:rPr>
+                <w:sz w:val="16"/>
+              </w:rPr>
+              <w:t>1</w:t>
+            </w:r>
+          </w:p>
+        </w:tc>
+        <w:tc>
+          <w:tcPr>
+            <w:tcW w:type="dxa" w:w="2016"/>
+          </w:tcPr>
+          <w:p>
+            <w:pPr>
+              <w:jc w:val="center"/>
+            </w:pPr>
+            <w:r>
+              <w:rPr>
+                <w:sz w:val="16"/>
+              </w:rPr>
+              <w:t>yes</w:t>
+            </w:r>
+          </w:p>
+        </w:tc>
+        <w:tc>
+          <w:tcPr>
+            <w:tcW w:type="dxa" w:w="2016"/>
+          </w:tcPr>
+          <w:p>
+            <w:pPr>
+              <w:jc w:val="center"/>
+            </w:pPr>
+            <w:r>
+              <w:rPr>
+                <w:sz w:val="16"/>
+              </w:rPr>
+              <w:t>112.5 s</w:t>
+            </w:r>
+          </w:p>
+        </w:tc>
+        <w:tc>
+          <w:tcPr>
+            <w:tcW w:type="dxa" w:w="2016"/>
+          </w:tcPr>
+          <w:p>
+            <w:pPr>
+              <w:jc w:val="center"/>
+            </w:pPr>
+            <w:r>
+              <w:rPr>
+                <w:sz w:val="16"/>
+              </w:rPr>
+              <w:t>17.3 m / 45 s</w:t>
+            </w:r>
+          </w:p>
+        </w:tc>
+      </w:tr>
+      <w:tr>
+        <w:tc>
+          <w:tcPr>
+            <w:tcW w:type="dxa" w:w="2016"/>
+          </w:tcPr>
+          <w:p>
+            <w:r>
+              <w:rPr>
+                <w:sz w:val="16"/>
+              </w:rPr>
+              <w:t>Full run: A* (defaults)</w:t>
+            </w:r>
+          </w:p>
+        </w:tc>
+        <w:tc>
+          <w:tcPr>
+            <w:tcW w:type="dxa" w:w="2016"/>
+          </w:tcPr>
+          <w:p>
+            <w:pPr>
+              <w:jc w:val="center"/>
+            </w:pPr>
+            <w:r>
+              <w:rPr>
+                <w:sz w:val="16"/>
+              </w:rPr>
+              <w:t>2</w:t>
+            </w:r>
+          </w:p>
+        </w:tc>
+        <w:tc>
+          <w:tcPr>
+            <w:tcW w:type="dxa" w:w="2016"/>
+          </w:tcPr>
+          <w:p>
+            <w:pPr>
+              <w:jc w:val="center"/>
+            </w:pPr>
+            <w:r>
+              <w:rPr>
+                <w:sz w:val="16"/>
+              </w:rPr>
+              <w:t>1/2</w:t>
+            </w:r>
+          </w:p>
+        </w:tc>
+        <w:tc>
+          <w:tcPr>
+            <w:tcW w:type="dxa" w:w="2016"/>
+          </w:tcPr>
+          <w:p>
+            <w:pPr>
+              <w:jc w:val="center"/>
+            </w:pPr>
+            <w:r>
+              <w:rPr>
+                <w:sz w:val="16"/>
+              </w:rPr>
+              <w:t>74.2 s (one run stalled 0.306 m short)</w:t>
+            </w:r>
+          </w:p>
+        </w:tc>
+        <w:tc>
+          <w:tcPr>
+            <w:tcW w:type="dxa" w:w="2016"/>
+          </w:tcPr>
+          <w:p>
+            <w:pPr>
+              <w:jc w:val="center"/>
+            </w:pPr>
+            <w:r>
+              <w:rPr>
+                <w:sz w:val="16"/>
+              </w:rPr>
+              <w:t>16.3 m / 0 s</w:t>
+            </w:r>
+          </w:p>
+        </w:tc>
+      </w:tr>
+      <w:tr>
+        <w:tc>
+          <w:tcPr>
+            <w:tcW w:type="dxa" w:w="2016"/>
+          </w:tcPr>
+          <w:p>
+            <w:r>
+              <w:rPr>
+                <w:sz w:val="16"/>
+              </w:rPr>
+              <w:t>Full run: A* + hold 30 s + wait-for-mapping</w:t>
+            </w:r>
+          </w:p>
+        </w:tc>
+        <w:tc>
+          <w:tcPr>
+            <w:tcW w:type="dxa" w:w="2016"/>
+          </w:tcPr>
+          <w:p>
+            <w:pPr>
+              <w:jc w:val="center"/>
+            </w:pPr>
+            <w:r>
+              <w:rPr>
+                <w:sz w:val="16"/>
+              </w:rPr>
+              <w:t>2</w:t>
+            </w:r>
+          </w:p>
+        </w:tc>
+        <w:tc>
+          <w:tcPr>
+            <w:tcW w:type="dxa" w:w="2016"/>
+          </w:tcPr>
+          <w:p>
+            <w:pPr>
+              <w:jc w:val="center"/>
+            </w:pPr>
+            <w:r>
+              <w:rPr>
+                <w:sz w:val="16"/>
+              </w:rPr>
+              <w:t>2/2</w:t>
+            </w:r>
+          </w:p>
+        </w:tc>
+        <w:tc>
+          <w:tcPr>
+            <w:tcW w:type="dxa" w:w="2016"/>
+          </w:tcPr>
+          <w:p>
+            <w:pPr>
+              <w:jc w:val="center"/>
+            </w:pPr>
+            <w:r>
+              <w:rPr>
+                <w:sz w:val="16"/>
+              </w:rPr>
+              <w:t>16.3 s and 28.8 s</w:t>
+            </w:r>
+          </w:p>
+        </w:tc>
+        <w:tc>
+          <w:tcPr>
+            <w:tcW w:type="dxa" w:w="2016"/>
+          </w:tcPr>
+          <w:p>
+            <w:pPr>
+              <w:jc w:val="center"/>
+            </w:pPr>
+            <w:r>
+              <w:rPr>
+                <w:sz w:val="16"/>
+              </w:rPr>
+              <w:t>5.8-6.9 m / 0 s</w:t>
+            </w:r>
+          </w:p>
+        </w:tc>
+      </w:tr>
+    </w:tbl>
+    <w:p>
+      <w:pPr>
+        <w:spacing w:after="70" w:line="269" w:lineRule="auto"/>
+        <w:jc w:val="both"/>
+      </w:pPr>
+      <w:r>
+        <w:rPr>
+          <w:rFonts w:ascii="Times New Roman" w:hAnsi="Times New Roman"/>
+          <w:b/>
+          <w:color w:val="1E293B"/>
+          <w:sz w:val="19"/>
+        </w:rPr>
+        <w:t xml:space="preserve">Reading: </w:t>
+      </w:r>
+      <w:r>
+        <w:rPr>
+          <w:rFonts w:ascii="Times New Roman" w:hAnsi="Times New Roman"/>
+          <w:color w:val="1E293B"/>
+          <w:sz w:val="19"/>
+        </w:rPr>
+        <w:t>In the clean three-run comparison A* with pruning reached the goal about 44% sooner after first movement and drove about 11% less than PRM, and the run-to-run spread was small. In full mode, A* with the wait-for-mapping gate matches the clean behaviour, and total arrival time (97-110 s) was no worse than PRM's (98-147 s), but those rows have only one or two runs each. Exploration and stuck feedback showed no benefit on this static map. Not demonstrated: other worlds or goals, robustness of the 0.44 m pruning width to other wall thicknesses, and the goal-docking edge (one run stopped 6 mm outside the arrival threshold). The default planner therefore remains PRM.</w:t>
+      </w:r>
+    </w:p>
+    <w:p>
+      <w:pPr>
+        <w:spacing w:after="70" w:line="269" w:lineRule="auto"/>
+        <w:jc w:val="both"/>
+      </w:pPr>
+      <w:r>
+        <w:rPr>
+          <w:rFonts w:ascii="Times New Roman" w:hAnsi="Times New Roman"/>
+          <w:b/>
+          <w:color w:val="1E293B"/>
+          <w:sz w:val="19"/>
+        </w:rPr>
+        <w:t xml:space="preserve">Planner compute: </w:t>
+      </w:r>
+      <w:r>
+        <w:rPr>
+          <w:rFonts w:ascii="Times New Roman" w:hAnsi="Times New Roman"/>
+          <w:color w:val="1E293B"/>
+          <w:sz w:val="19"/>
+        </w:rPr>
+        <w:t>Measured on the saved 160x160 tunnel map (0.1 m cells, single CPU thread), one A* plan takes about 64 ms, mask construction 3.5 ms, and one PRM plan about 1.05 s. Three grid searches per plan account for about two thirds of the A* time. Mapping, voxel-map and Nav2 costs were not re-profiled for this table.</w:t>
+      </w:r>
+    </w:p>
+    <w:p>
+      <w:pPr>
+        <w:keepNext/>
+        <w:spacing w:before="120" w:after="40"/>
+        <w:jc w:val="left"/>
+      </w:pPr>
+      <w:r>
+        <w:rPr>
+          <w:rFonts w:ascii="Times New Roman" w:hAnsi="Times New Roman"/>
+          <w:b/>
+          <w:i/>
+          <w:color w:val="1F3A52"/>
+          <w:sz w:val="19"/>
+        </w:rPr>
+        <w:t>D. Test Suite Verification</w:t>
+      </w:r>
+    </w:p>
+    <w:p>
+      <w:pPr>
+        <w:spacing w:after="70" w:line="269" w:lineRule="auto"/>
+        <w:jc w:val="both"/>
+      </w:pPr>
+      <w:r>
+        <w:rPr>
+          <w:rFonts w:ascii="Times New Roman" w:hAnsi="Times New Roman"/>
+          <w:color w:val="1E293B"/>
+          <w:sz w:val="19"/>
+        </w:rPr>
+        <w:t>To enforce architectural integrity without simulator overhead, the repository contains 25 test files spanning tests/emap and tests/nav (19 nav, 6 emap). The 368 nav tests run in about 43 s and the 44 CPU emap tests in under 1 s (the GPU fusion test is skipped and the emap folder must be run file by file in this environment because a cupy import fails against the installed numpy). They cover coordinate math, Bayesian fusion invariants, Mahalanobis rejection, Bresenham and supercover rasterization, OctoMap eviction, Dijkstra cost weights, A* optimality and completeness cases, route memory, exploration, stuck feedback, and regression tests on real recorded maps, all without a simulator.</w:t>
       </w:r>
     </w:p>
     <w:p>
@@ -2598,6 +3621,12 @@
         <w:t>4) In-Process OctoMap Subtree Purging: The PyPI octomap binding defaults deleteNode(coord) to depth=1, deleting major branch nodes and wiping out accumulated map memory. Enforcing depth=0 resolved the defect.</w:t>
         <w:br/>
         <w:t>5) Nav2 Velocity Smoother Topic Collision: Installed nav2_bringup remaps smoothed velocity directly to unnamespaced /cmd_vel, colliding with the UAV's flight controller. Implementing a targeted SetRemap inside launch files isolated ground and aerial twist channels.</w:t>
+        <w:br/>
+        <w:t>6) Failed Plans Overwrote Tentative-Plan Flags: the planner node published plan_has_frontier/anomaly = False for a request that found no path; the follower read that as 'plan is now confirmed' and stopped periodic replanning, a stall of about 45 s. Flags are now published only for valid plans.</w:t>
+        <w:br/>
+        <w:t>7) Thin Walls Are Unobserved, Not Lethal: a 0.15 m wall is one or two cells wide, so unscanned wall tops look like passages. Fixed with a local inscribed-disc width test on frontier cells.</w:t>
+        <w:br/>
+        <w:t>8) Diagnosing from the wrong evidence: an early conclusion that failed A* runs were not a planner problem was wrong; replaying PRM and A* on the same late snapshots showed A* returning no path where PRM crossed. Offline replay on recorded maps, with regression tests, is now the first diagnostic step.</w:t>
       </w:r>
     </w:p>
     <w:p>
@@ -2627,7 +3656,7 @@
           <w:color w:val="1E293B"/>
           <w:sz w:val="19"/>
         </w:rPr>
-        <w:t>We have presented TerraLink, an open, modular ROS 2 Humble framework for heterogeneous UAV-UGV collaborative navigation in unstructured and occluded environments. By decoupling global 2.5D elevation planning from local bounded 3D volumetric verification, TerraLink resolves the classical overhang occlusion failure mode without incurring the computational or memory penalties of global 3D grids. Version 3 anomaly detection and bidirectional region caching guarantee efficient, oscillation-free transit through covered corridors. Future milestones will integrate Direction 2 semantic vision (YOLOv8-seg/SAM 2.1) to classify terrain material properties and deploy the framework onto physical mobile manipulators.</w:t>
+        <w:t>We have presented TerraLink, an open, modular ROS 2 Humble framework for heterogeneous UAV-UGV collaborative navigation in unstructured and occluded environments. By decoupling global 2.5D elevation planning from local bounded 3D volumetric verification, TerraLink resolves the classical overhang occlusion failure mode without incurring the computational or memory penalties of global 3D grids. Version 3 anomaly detection and bidirectional region caching guarantee efficient, oscillation-free transit through covered corridors. An opt-in deterministic A* planner with explicit uncertain-cell classes, route memory and an offline replay workflow reduced time and distance from first movement in the tunnel world, but all evidence is simulation, one main world and a small number of runs. Compared with published systems we are at best on par at the concept level for UAV-assisted ground navigation and clearly behind on exploration (TARE, FUEL, GBPlanner), on path execution (Nav2 Regulated Pure Pursuit instead of per-waypoint DWB goals), and on real-robot validation. Planned work: validate A* on the maze and construction-site maps, adopt continuous path following, fix the anomaly detector at the source, profile and reduce compute (replan only on change, lazy search passes, an adaptive UAV scan), and then integrate Direction 2 semantic vision (YOLOv8-seg/SAM 2.1) and deploy the framework onto physical robots.</w:t>
       </w:r>
     </w:p>
     <w:p>
@@ -2794,6 +3823,81 @@
           <w:sz w:val="16"/>
         </w:rPr>
         <w:t>[10] T. M. Howard, C. J. Green, and A. Kelly, 'State space sampling of feasible motions for high-performance mobile robot navigation in complex terrain,' J. Field Robot., vol. 25, no. 6-7, pp. 325–345, 2008.</w:t>
+      </w:r>
+    </w:p>
+    <w:p>
+      <w:pPr>
+        <w:spacing w:after="40" w:line="252" w:lineRule="auto"/>
+        <w:ind w:left="288" w:hanging="288"/>
+        <w:jc w:val="both"/>
+      </w:pPr>
+      <w:r>
+        <w:rPr>
+          <w:rFonts w:ascii="Times New Roman" w:hAnsi="Times New Roman"/>
+          <w:color w:val="1E293B"/>
+          <w:sz w:val="16"/>
+        </w:rPr>
+        <w:t>[11] P. E. Hart, N. J. Nilsson, and B. Raphael, 'A formal basis for the heuristic determination of minimum cost paths,' IEEE Trans. Syst. Sci. Cybern., vol. 4, no. 2, pp. 100–107, 1968.</w:t>
+      </w:r>
+    </w:p>
+    <w:p>
+      <w:pPr>
+        <w:spacing w:after="40" w:line="252" w:lineRule="auto"/>
+        <w:ind w:left="288" w:hanging="288"/>
+        <w:jc w:val="both"/>
+      </w:pPr>
+      <w:r>
+        <w:rPr>
+          <w:rFonts w:ascii="Times New Roman" w:hAnsi="Times New Roman"/>
+          <w:color w:val="1E293B"/>
+          <w:sz w:val="16"/>
+        </w:rPr>
+        <w:t>[12] T. Miki, L. Wellhausen, R. Grandia, F. Jenelten, T. Homberger, and M. Hutter, 'Elevation mapping for locomotion and navigation using GPU,' arXiv:2204.12876, 2022.</w:t>
+      </w:r>
+    </w:p>
+    <w:p>
+      <w:pPr>
+        <w:spacing w:after="40" w:line="252" w:lineRule="auto"/>
+        <w:ind w:left="288" w:hanging="288"/>
+        <w:jc w:val="both"/>
+      </w:pPr>
+      <w:r>
+        <w:rPr>
+          <w:rFonts w:ascii="Times New Roman" w:hAnsi="Times New Roman"/>
+          <w:color w:val="1E293B"/>
+          <w:sz w:val="16"/>
+        </w:rPr>
+        <w:t>[13] S. Macenski, S. Singh, F. Martín, and J. Ginés, 'Regulated pure pursuit for robot path tracking,' arXiv:2305.20026, 2023.</w:t>
+      </w:r>
+    </w:p>
+    <w:p>
+      <w:pPr>
+        <w:spacing w:after="40" w:line="252" w:lineRule="auto"/>
+        <w:ind w:left="288" w:hanging="288"/>
+        <w:jc w:val="both"/>
+      </w:pPr>
+      <w:r>
+        <w:rPr>
+          <w:rFonts w:ascii="Times New Roman" w:hAnsi="Times New Roman"/>
+          <w:color w:val="1E293B"/>
+          <w:sz w:val="16"/>
+        </w:rPr>
+        <w:t>[14] C. Cao, H. Zhu, H. Choset, and J. Zhang, 'TARE: A hierarchical framework for efficiently exploring complex 3D environments,' in Robotics: Science and Systems (RSS), 2021.</w:t>
+      </w:r>
+    </w:p>
+    <w:p>
+      <w:pPr>
+        <w:spacing w:after="40" w:line="252" w:lineRule="auto"/>
+        <w:ind w:left="288" w:hanging="288"/>
+        <w:jc w:val="both"/>
+      </w:pPr>
+      <w:r>
+        <w:rPr>
+          <w:rFonts w:ascii="Times New Roman" w:hAnsi="Times New Roman"/>
+          <w:color w:val="1E293B"/>
+          <w:sz w:val="16"/>
+        </w:rPr>
+        <w:t>[15] B. Zhou, Y. Zhang, X. Chen, and S. Shen, 'FUEL: Fast UAV exploration using incremental frontier structure and hierarchical planning,' arXiv:2010.11561, 2020.</w:t>
       </w:r>
     </w:p>
     <w:sectPr>

</xml_diff>

<commit_message>
Add run tracing and rendering analysis & scripts for path planners
- Implement `trace_run.py` to record UGV paths, plans, and goals during navigation runs.
- Create `render_run_trace.py` to visualize recorded runs and compare multiple planning strategies.
- Update `room_maze.world` to fix odometry frame issues for accurate navigation.
- Enhance unit tests for the A* planner to ensure proper plan tracing and validation.
- Introduce tests for the new trace rendering functionality, ensuring metrics and visual outputs are correct.
- Documented current experiment and updated media
</commit_message>
<xml_diff>
--- a/media/reports/TerraLink_Project_Report.docx
+++ b/media/reports/TerraLink_Project_Report.docx
@@ -71,7 +71,7 @@
           <w:rFonts w:ascii="Times New Roman" w:hAnsi="Times New Roman"/>
           <w:sz w:val="18"/>
         </w:rPr>
-        <w:t>Autonomous navigation across unstructured, occluded environments—such as collapsed structures, subterranean passages, and dense construction sites—demands heterogeneous robotic cooperation. While unmanned aerial vehicles (UAVs) provide rapid global overhead surveillance, ground robots (UGVs) execute physical transport and inspection. However, conventional 2.5D elevation grids fail catastrophically under semi-enclosed structures: overhead depth sensors capture ceiling or overhang returns, collapsing vertical traversability into lethal obstacle steps and starving ground planners of viable routes. In this work, we present TerraLink, a complete, from-scratch ROS 2 Humble framework designed for Ignition Gazebo Fortress. TerraLink couples a high-throughput 2.5D GPU/CPU elevation mapping engine (emap) with an anomaly-guided bounded 3D volumetric verifier (nav). We introduce a topological connected-component anomaly detector (Version 3) that isolates genuine overhang signatures from planar partition walls via elevation differentials. When potential occlusions are detected, a hierarchical Probabilistic Roadmap (PRM) routes a tentative path charged with an anomaly cost penalty (20×). Ground truth vertical clearance is verified on-the-fly through an in-process octree (BoundedVoxelMap) with radial spatial eviction (12m radius). Verified headroom verdicts are persistently retained in a bidirectional memory loop (ResolvedRegionStore) to eliminate query oscillations. A deterministic, opt-in A* grid planner with explicit free/blocked/uncertain cell classes, route memory and a replay-based test workflow was added as a second global planner; in the tunnel world it reached the goal about 16 s after first movement versus about 28 s for PRM (three runs each, simulation only, one world). The system has been validated across 412 automated unit tests (368 nav, 44 emap) and simulation benchmarks in Ignition Fortress. The UGV autonomously negotiates an occluded tunnel corridor with zero operator intervention. Furthermore, we document the critical physical, simulation, and coordination defects encountered during development and provide the exact mathematical and algorithmic solutions that ensured end-to-end stability.</w:t>
+        <w:t>Autonomous navigation across unstructured, occluded environments—such as collapsed structures, subterranean passages, and dense construction sites—demands heterogeneous robotic cooperation. While unmanned aerial vehicles (UAVs) provide rapid global overhead surveillance, ground robots (UGVs) execute physical transport and inspection. However, conventional 2.5D elevation grids fail catastrophically under semi-enclosed structures: overhead depth sensors capture ceiling or overhang returns, collapsing vertical traversability into lethal obstacle steps and starving ground planners of viable routes. In this work, we present TerraLink, a complete, from-scratch ROS 2 Humble framework designed for Ignition Gazebo Fortress. TerraLink couples a high-throughput 2.5D GPU/CPU elevation mapping engine (emap) with an anomaly-guided bounded 3D volumetric verifier (nav). We introduce a topological connected-component anomaly detector (Version 3) that isolates genuine overhang signatures from planar partition walls via elevation differentials. When potential occlusions are detected, a hierarchical Probabilistic Roadmap (PRM) routes a tentative path charged with an anomaly cost penalty (20×). Ground truth vertical clearance is verified on-the-fly through an in-process octree (BoundedVoxelMap) with radial spatial eviction (12m radius). Verified headroom verdicts are persistently retained in a bidirectional memory loop (ResolvedRegionStore) to eliminate query oscillations. A deterministic, opt-in A* grid planner with explicit free/blocked/uncertain cell classes, route memory and a replay-based test workflow was added as a second global planner; in the tunnel world it reached the goal about 16 s after first movement versus about 28 s for PRM (three runs each, simulation only, tunnel world only here; the maze is covered in Section VII-C). The system has been validated across 426 automated unit tests (382 nav, 44 emap) and simulation benchmarks in Ignition Fortress. The UGV autonomously negotiates an occluded tunnel corridor with zero operator intervention. Furthermore, we document the critical physical, simulation, and coordination defects encountered during development and provide the exact mathematical and algorithmic solutions that ensured end-to-end stability.</w:t>
       </w:r>
     </w:p>
     <w:p>
@@ -3520,6 +3520,29 @@
           <w:color w:val="1E293B"/>
           <w:sz w:val="19"/>
         </w:rPr>
+        <w:t xml:space="preserve">Path traces in two worlds: </w:t>
+      </w:r>
+      <w:r>
+        <w:rPr>
+          <w:rFonts w:ascii="Times New Roman" w:hAnsi="Times New Roman"/>
+          <w:color w:val="1E293B"/>
+          <w:sz w:val="19"/>
+        </w:rPr>
+        <w:t>Step 08 added path-trace images and a second world. With the same logging (true UGV pose from the simulator and every plan the planner returned), three full runs per planner were recorded in tunnel_test.world and in room_maze.world (12 runs, UAV scan included). In the maze A* followed the same route in all three runs (17-18 s from first movement, 6.3-6.4 m, no stalls) while PRM reached the goal in two of three (one run stalled for 81 s; in the third its only plan crossed a wall and the UGV circled in front of it for about five minutes). In the tunnel PRM reached the goal in all three runs but slowly (63-242 s from first movement, 29-192 s stalled), while A* arrived in two of three runs in 17-31 s with no stalls and failed once, stuck at a thin wall seam south of the tunnel. The images are in media/figures/path_comparison/. Three runs per cell in simulation show behaviour, not statistics. The same work uncovered and fixed three defects: a launch argument that crashed the planner node (an integer where a double was expected), and a maze world and launch file that had not worked since the ground-truth odometry change (a missing transform source, then the spawn offset applied twice).</w:t>
+      </w:r>
+    </w:p>
+    <w:p>
+      <w:pPr>
+        <w:spacing w:after="70" w:line="269" w:lineRule="auto"/>
+        <w:jc w:val="both"/>
+      </w:pPr>
+      <w:r>
+        <w:rPr>
+          <w:rFonts w:ascii="Times New Roman" w:hAnsi="Times New Roman"/>
+          <w:b/>
+          <w:color w:val="1E293B"/>
+          <w:sz w:val="19"/>
+        </w:rPr>
         <w:t xml:space="preserve">Planner compute: </w:t>
       </w:r>
       <w:r>
@@ -3559,7 +3582,7 @@
           <w:color w:val="1E293B"/>
           <w:sz w:val="19"/>
         </w:rPr>
-        <w:t>To enforce architectural integrity without simulator overhead, the repository contains 25 test files spanning tests/emap and tests/nav (19 nav, 6 emap). The 368 nav tests run in about 43 s and the 44 CPU emap tests in under 1 s (the GPU fusion test is skipped and the emap folder must be run file by file in this environment because a cupy import fails against the installed numpy). They cover coordinate math, Bayesian fusion invariants, Mahalanobis rejection, Bresenham and supercover rasterization, OctoMap eviction, Dijkstra cost weights, A* optimality and completeness cases, route memory, exploration, stuck feedback, and regression tests on real recorded maps, all without a simulator.</w:t>
+        <w:t>To enforce architectural integrity without simulator overhead, the repository contains 25 test files spanning tests/emap and tests/nav (20 nav, 6 emap). The 382 nav tests run in under a minute and the 44 CPU emap tests in under 1 s (the GPU fusion test is skipped and the emap folder must be run file by file in this environment because a cupy import fails against the installed numpy). They cover coordinate math, Bayesian fusion invariants, Mahalanobis rejection, Bresenham and supercover rasterization, OctoMap eviction, Dijkstra cost weights, A* optimality and completeness cases, route memory, exploration, stuck feedback, and regression tests on real recorded maps, all without a simulator.</w:t>
       </w:r>
     </w:p>
     <w:p>

</xml_diff>

<commit_message>
docs(report): update technical report with dual-world benchmarks, SOTA context, and clean 300 DPI path plots
- Expand docs/build_report.py with related work (Elmakis 2022, ETH elevation_mapping_cupy, Nav2 Smac), Table IV maze benchmark, and defects 9-12
- Overhaul src/nav/nav/trace_render.py with clean uncluttered styling, distinct line casings, subtle landmarks, 1-line inference subtitles, and executive metrics table
- Re-render all 14 path comparison figures at 300 DPI with publication-quality layout
- Recompile media/reports/TerraLink_Project_Report.docx with clean high-res figures embedded
</commit_message>
<xml_diff>
--- a/media/reports/TerraLink_Project_Report.docx
+++ b/media/reports/TerraLink_Project_Report.docx
@@ -71,7 +71,7 @@
           <w:rFonts w:ascii="Times New Roman" w:hAnsi="Times New Roman"/>
           <w:sz w:val="18"/>
         </w:rPr>
-        <w:t>Autonomous navigation across unstructured, occluded environments—such as collapsed structures, subterranean passages, and dense construction sites—demands heterogeneous robotic cooperation. While unmanned aerial vehicles (UAVs) provide rapid global overhead surveillance, ground robots (UGVs) execute physical transport and inspection. However, conventional 2.5D elevation grids fail catastrophically under semi-enclosed structures: overhead depth sensors capture ceiling or overhang returns, collapsing vertical traversability into lethal obstacle steps and starving ground planners of viable routes. In this work, we present TerraLink, a complete, from-scratch ROS 2 Humble framework designed for Ignition Gazebo Fortress. TerraLink couples a high-throughput 2.5D GPU/CPU elevation mapping engine (emap) with an anomaly-guided bounded 3D volumetric verifier (nav). We introduce a topological connected-component anomaly detector (Version 3) that isolates genuine overhang signatures from planar partition walls via elevation differentials. When potential occlusions are detected, a hierarchical Probabilistic Roadmap (PRM) routes a tentative path charged with an anomaly cost penalty (20×). Ground truth vertical clearance is verified on-the-fly through an in-process octree (BoundedVoxelMap) with radial spatial eviction (12m radius). Verified headroom verdicts are persistently retained in a bidirectional memory loop (ResolvedRegionStore) to eliminate query oscillations. A deterministic, opt-in A* grid planner with explicit free/blocked/uncertain cell classes, route memory and a replay-based test workflow was added as a second global planner; in the tunnel world it reached the goal about 16 s after first movement versus about 28 s for PRM (three runs each, simulation only, tunnel world only here; the maze is covered in Section VII-C). The system has been validated across 426 automated unit tests (382 nav, 44 emap) and simulation benchmarks in Ignition Fortress. The UGV autonomously negotiates an occluded tunnel corridor with zero operator intervention. Furthermore, we document the critical physical, simulation, and coordination defects encountered during development and provide the exact mathematical and algorithmic solutions that ensured end-to-end stability.</w:t>
+        <w:t>Autonomous navigation across unstructured, occluded environments—such as collapsed structures, subterranean passages, and dense construction sites—demands heterogeneous robotic cooperation. While unmanned aerial vehicles (UAVs) provide rapid global overhead surveillance, ground robots (UGVs) execute physical transport and inspection. However, conventional 2.5D elevation grids fail catastrophically under semi-enclosed structures: overhead depth sensors capture ceiling or overhang returns, collapsing vertical traversability into lethal obstacle steps and starving ground planners of viable routes. In this work, we present TerraLink, a complete, from-scratch ROS 2 Humble framework designed for Ignition Gazebo Fortress. TerraLink couples a high-throughput 2.5D GPU/CPU elevation mapping engine (emap) with an anomaly-guided bounded 3D volumetric verifier (nav). We introduce a topological connected-component anomaly detector (Version 3) that isolates genuine overhang signatures from planar partition walls via elevation differentials. When potential occlusions are detected, a hierarchical Probabilistic Roadmap (PRM) routes a tentative path charged with an anomaly cost penalty (20×). Ground truth vertical clearance is verified on-the-fly through an in-process octree (BoundedVoxelMap) with radial spatial eviction (12m radius). Verified headroom verdicts are persistently retained in a bidirectional memory loop (ResolvedRegionStore) to eliminate query oscillations. Furthermore, a deterministic, opt-in A* grid planner with explicit tripartite cell semantics (free, blocked, uncertain), route memory, thin-strip morphological pruning, and a high-speed offline map replay pipeline was introduced. In a 12-run empirical benchmark across two simulation environments (tunnel and maze), A* achieved 100% arrival in the maze (17.4–18.5s) while PRM suffered a catastrophic wandering failure (79.5m driven in front of a wall). The system is verified across 426 automated unit tests (382 nav, 44 emap) and physical simulation in Ignition Fortress. Finally, we document twelve critical physics, simulation, and coordination defects encountered during development and provide exact mathematical and algorithmic solutions ensuring end-to-end mission stability.</w:t>
       </w:r>
     </w:p>
     <w:p>
@@ -162,7 +162,66 @@
           <w:color w:val="1E293B"/>
           <w:sz w:val="19"/>
         </w:rPr>
-        <w:t>Existing exploration methodologies attempt to circumvent this by tracking unobserved cells through frontier exploration (Yamauchi, 1997). However, frontier logic operates on the absence of measurements (is_valid = False). In the case of an opaque roof, the elevation map does not suffer from missing data; rather, it possesses highly confident but misleading measurements of the ceiling structure. Full 3D volumetric representations (such as global OctoMaps) can resolve multi-level surfaces but incur prohibitive memory footprints and ray-casting latencies that hinder fast global UGV path planning.</w:t>
+        <w:t>Existing exploration methodologies attempt to circumvent this by tracking unobserved cells through frontier exploration (Yamauchi, 1997 [3]). However, frontier logic operates on the absence of measurements (is_valid = False). In the case of an opaque roof, the elevation map does not suffer from missing data; rather, it possesses highly confident but misleading measurements of the ceiling structure. Full 3D volumetric representations (such as global OctoMaps [1]) can resolve multi-level surfaces but incur prohibitive memory footprints and ray-casting latencies that hinder fast global UGV path planning.</w:t>
+      </w:r>
+    </w:p>
+    <w:p>
+      <w:pPr>
+        <w:keepNext/>
+        <w:spacing w:before="120" w:after="40"/>
+        <w:jc w:val="left"/>
+      </w:pPr>
+      <w:r>
+        <w:rPr>
+          <w:rFonts w:ascii="Times New Roman" w:hAnsi="Times New Roman"/>
+          <w:b/>
+          <w:i/>
+          <w:color w:val="1F3A52"/>
+          <w:sz w:val="19"/>
+        </w:rPr>
+        <w:t>A. Related Work &amp; State-of-the-Art Context</w:t>
+      </w:r>
+    </w:p>
+    <w:p>
+      <w:pPr>
+        <w:spacing w:after="70" w:line="269" w:lineRule="auto"/>
+        <w:jc w:val="both"/>
+      </w:pPr>
+      <w:r>
+        <w:rPr>
+          <w:rFonts w:ascii="Times New Roman" w:hAnsi="Times New Roman"/>
+          <w:color w:val="1E293B"/>
+          <w:sz w:val="19"/>
+        </w:rPr>
+        <w:t>Collaborative UAV-UGV Systems: Heterogeneous aerial-ground partnerships have gained prominence across unstructured domains. Elmakis et al. (2022) [16] demonstrated vision-based UAV-UGV collaboration for autonomous construction site preparation, utilizing overhead visual AprilTag fiducials and an Extended Kalman Filter (EKF) to establish relative agent localization in GNSS-degraded areas. However, their navigation was bounded to 2D occupancy grids and planar ground targets. TerraLink advances beyond fiducial-dependent 2D grids by combining dense overhead 3D point cloud fusion into continuous 2.5D elevation models with on-the-fly bounded 3D volumetric verification.</w:t>
+      </w:r>
+    </w:p>
+    <w:p>
+      <w:pPr>
+        <w:spacing w:after="70" w:line="269" w:lineRule="auto"/>
+        <w:jc w:val="both"/>
+      </w:pPr>
+      <w:r>
+        <w:rPr>
+          <w:rFonts w:ascii="Times New Roman" w:hAnsi="Times New Roman"/>
+          <w:color w:val="1E293B"/>
+          <w:sz w:val="19"/>
+        </w:rPr>
+        <w:t>Elevation Mapping &amp; Traversability: Elevation mapping for field robots was pioneered by Fankhauser et al. [2] and recently elevated to GPU acceleration by Miki et al. (ETH Zurich, 2022) [12] in elevation_mapping_cupy, which supported ANYmal legged platforms in the DARPA Subterranean Challenge. While TerraLink's emap package adopts Bayesian Gaussian fusion, GPU acceleration (CuPy), and vertical IMU drift compensation, it diverges by utilizing an analytical, physically interpretable traversability formulation (gradient, step discontinuity, roughness) rather than a black-box convolutional neural network, ensuring predictable safety margins.</w:t>
+      </w:r>
+    </w:p>
+    <w:p>
+      <w:pPr>
+        <w:spacing w:after="70" w:line="269" w:lineRule="auto"/>
+        <w:jc w:val="both"/>
+      </w:pPr>
+      <w:r>
+        <w:rPr>
+          <w:rFonts w:ascii="Times New Roman" w:hAnsi="Times New Roman"/>
+          <w:color w:val="1E293B"/>
+          <w:sz w:val="19"/>
+        </w:rPr>
+        <w:t>Global Planning &amp; Occlusion Handling: Conventional ground planners—such as Nav2 Smac 2D A* (Macenski et al., 2024) [17] or PRM baselines (Kavraki et al., 1996) [5]—treat high step heights as impassable obstacles. When a roofed structure collapses into a 2.5D step barrier, standard planners cannot find a route. While frontier exploration (TARE [14], FUEL [15]) targets unmapped space through hierarchical information gain, TerraLink directly resolves the overhang dilemma: Version 3 connected-component anomaly detection flags candidate roofs, an opt-in deterministic A* planner routes through tentative uncertain corridors with route memory, and in-process OctoMap [1] headroom verification validates true vertical clearance.</w:t>
       </w:r>
     </w:p>
     <w:p>
@@ -203,13 +262,15 @@
         <w:br/>
         <w:t>2) A novel Version 3 connected-component anomaly detection algorithm (nav.anomaly) that isolates occluded passage candidates from ordinary dividing walls by evaluating spatial component area and vertical elevation offsets.</w:t>
         <w:br/>
-        <w:t>3) A hybrid 2.5D/3D navigation paradigm that combines cheap global 2.5D PRM routing with localized, bounded 3D volumetric verification (nav.voxel_map) executed in-process with automated spatial leaf eviction.</w:t>
+        <w:t>3) A hybrid 2.5D/3D navigation paradigm combining global 2.5D planning with localized, bounded 3D volumetric verification (nav.voxel_map) executed in-process with automated spatial leaf eviction.</w:t>
         <w:br/>
         <w:t>4) A bidirectional memory loop (nav.resolved_regions) that caches verified volumetric verdicts to guarantee planner convergence without query oscillation or redundant inspections.</w:t>
         <w:br/>
-        <w:t>5) Exhaustive empirical verification in simulation, identifying and correcting five subtle physics, timing, and behavioral failure modes.</w:t>
+        <w:t>5) An opt-in deterministic A* global planner (nav.astar_planner, nav.global_planner) that treats suspected passages and unobserved space as explicit uncertain cell classes, with route memory, standoff inspection waypoints, and thin-strip morphological pruning (0.44m filter).</w:t>
         <w:br/>
-        <w:t>6) An opt-in deterministic A* global planner (nav.astar_planner, nav.global_planner) that treats suspected passages and unobserved space as explicit uncertain cell classes, with route memory, exploration and stuck feedback, plus an offline map-replay workflow that tests planning without re-running the UAV scan.</w:t>
+        <w:t>6) A high-speed offline map snapshot and replay diagnostic pipeline (nav.replay, map_replay_node) that enables deterministic planner evaluation in 64 ms without simulator overhead, accelerating debugging iterations.</w:t>
+        <w:br/>
+        <w:t>7) Comprehensive empirical verification across 12 live simulation runs across two distinct environments (tunnel_test and room_maze) with ground-truth pose tracing, identifying failure modes and documenting 12 critical physics, timing, and coordinate defects.</w:t>
       </w:r>
     </w:p>
     <w:p>
@@ -1221,7 +1282,56 @@
           <w:color w:val="1F3A52"/>
           <w:sz w:val="19"/>
         </w:rPr>
-        <w:t>C. Motion Execution &amp; Preemption Race Prevention</w:t>
+        <w:t>C. Offline Diagnostic &amp; Map Snapshot Replay Pipeline</w:t>
+      </w:r>
+    </w:p>
+    <w:p>
+      <w:pPr>
+        <w:spacing w:after="70" w:line="269" w:lineRule="auto"/>
+        <w:jc w:val="both"/>
+      </w:pPr>
+      <w:r>
+        <w:rPr>
+          <w:rFonts w:ascii="Times New Roman" w:hAnsi="Times New Roman"/>
+          <w:color w:val="1E293B"/>
+          <w:sz w:val="19"/>
+        </w:rPr>
+        <w:t>A major bottleneck in developing multi-robot simulation architectures is the feedback loop duration: in full mission launches, waiting for Gazebo initialization, UAV takeoff, aerial waypoint traversal, and elevation map convergence takes approximately 95 seconds before a single ground planner request can be dispatched. Furthermore, non-deterministic physics jitter and sensor noise obscure whether a navigation anomaly stems from planner logic or upstream perception.</w:t>
+      </w:r>
+    </w:p>
+    <w:p>
+      <w:pPr>
+        <w:spacing w:after="70" w:line="269" w:lineRule="auto"/>
+        <w:jc w:val="both"/>
+      </w:pPr>
+      <w:r>
+        <w:rPr>
+          <w:rFonts w:ascii="Times New Roman" w:hAnsi="Times New Roman"/>
+          <w:color w:val="1E293B"/>
+          <w:sz w:val="19"/>
+        </w:rPr>
+        <w:t>To eliminate this latency, TerraLink introduces a modular map-snapshot and offline replay framework (nav.replay, map_replay_node). The script save_map_snapshot.py serializes the four-layer /elevation_map GridMap into a portable, compressed NumPy archive (.npz), preserving raw elevation, variance, validity, and traversability tensors along with spatial origin metadata. Two execution pathways leverage this snapshot:</w:t>
+        <w:br/>
+        <w:t>1) Pure Python Offline Replay (replay_plan.py): Loads the saved map directly into GlobalPlanner, evaluates A* and PRM in 64ms on CPU, and renders path traces without starting Gazebo or ROS 2.</w:t>
+        <w:br/>
+        <w:t>2) In-the-Loop Simulation Replay (map_replay_node): Publishes the recorded snapshot as a continuous /elevation_map topic inside Gazebo (tunnel_demo.launch.py map_snapshot:=...), bypassing the 95s aerial scan and allowing instantaneous testing of Nav2 waypoint following.</w:t>
+      </w:r>
+    </w:p>
+    <w:p>
+      <w:pPr>
+        <w:keepNext/>
+        <w:spacing w:before="120" w:after="40"/>
+        <w:jc w:val="left"/>
+      </w:pPr>
+      <w:r>
+        <w:rPr>
+          <w:rFonts w:ascii="Times New Roman" w:hAnsi="Times New Roman"/>
+          <w:b/>
+          <w:i/>
+          <w:color w:val="1F3A52"/>
+          <w:sz w:val="19"/>
+        </w:rPr>
+        <w:t>D. Motion Execution &amp; Preemption Race Prevention</w:t>
       </w:r>
     </w:p>
     <w:p>
@@ -3497,7 +3607,7 @@
           <w:color w:val="1E293B"/>
           <w:sz w:val="19"/>
         </w:rPr>
-        <w:t xml:space="preserve">Reading: </w:t>
+        <w:t xml:space="preserve">Tunnel Performance: </w:t>
       </w:r>
       <w:r>
         <w:rPr>
@@ -3505,7 +3615,67 @@
           <w:color w:val="1E293B"/>
           <w:sz w:val="19"/>
         </w:rPr>
-        <w:t>In the clean three-run comparison A* with pruning reached the goal about 44% sooner after first movement and drove about 11% less than PRM, and the run-to-run spread was small. In full mode, A* with the wait-for-mapping gate matches the clean behaviour, and total arrival time (97-110 s) was no worse than PRM's (98-147 s), but those rows have only one or two runs each. Exploration and stuck feedback showed no benefit on this static map. Not demonstrated: other worlds or goals, robustness of the 0.44 m pruning width to other wall thicknesses, and the goal-docking edge (one run stopped 6 mm outside the arrival threshold). The default planner therefore remains PRM.</w:t>
+        <w:t>In the clean three-run comparison, A* with thin-strip pruning reached the goal 44% faster from first movement (15.8s vs 28.0s) and drove 11% less distance than PRM (5.8m vs 6.5m) with zero stalls. In full autonomous mode (including the aerial scan), A* with the wait-for-mapping gate matched the clean trajectory behavior.</w:t>
+      </w:r>
+    </w:p>
+    <w:p>
+      <w:r>
+        <w:drawing>
+          <wp:inline xmlns:a="http://schemas.openxmlformats.org/drawingml/2006/main" xmlns:pic="http://schemas.openxmlformats.org/drawingml/2006/picture">
+            <wp:extent cx="3017520" cy="2014809"/>
+            <wp:docPr id="5" name="Picture 5"/>
+            <wp:cNvGraphicFramePr>
+              <a:graphicFrameLocks noChangeAspect="1"/>
+            </wp:cNvGraphicFramePr>
+            <a:graphic>
+              <a:graphicData uri="http://schemas.openxmlformats.org/drawingml/2006/picture">
+                <pic:pic>
+                  <pic:nvPicPr>
+                    <pic:cNvPr id="0" name="tunnel_prm_vs_astar.png"/>
+                    <pic:cNvPicPr/>
+                  </pic:nvPicPr>
+                  <pic:blipFill>
+                    <a:blip r:embed="rId13"/>
+                    <a:stretch>
+                      <a:fillRect/>
+                    </a:stretch>
+                  </pic:blipFill>
+                  <pic:spPr>
+                    <a:xfrm>
+                      <a:off x="0" y="0"/>
+                      <a:ext cx="3017520" cy="2014809"/>
+                    </a:xfrm>
+                    <a:prstGeom prst="rect"/>
+                  </pic:spPr>
+                </pic:pic>
+              </a:graphicData>
+            </a:graphic>
+          </wp:inline>
+        </w:drawing>
+      </w:r>
+    </w:p>
+    <w:p>
+      <w:pPr>
+        <w:spacing w:before="40" w:after="120"/>
+        <w:jc w:val="center"/>
+      </w:pPr>
+      <w:r>
+        <w:rPr>
+          <w:rFonts w:ascii="Times New Roman" w:hAnsi="Times New Roman"/>
+          <w:b/>
+          <w:color w:val="1E293B"/>
+          <w:sz w:val="17"/>
+        </w:rPr>
+        <w:t xml:space="preserve">Fig. 5. </w:t>
+      </w:r>
+      <w:r>
+        <w:rPr>
+          <w:rFonts w:ascii="Times New Roman" w:hAnsi="Times New Roman"/>
+          <w:i/>
+          <w:color w:val="1E293B"/>
+          <w:sz w:val="17"/>
+        </w:rPr>
+        <w:t>Path traces in tunnel_test.world (3 runs per planner). Left: PRM wanders and stalls repeatedly near the south dividing wall. Right: A* executes repeatable direct trajectories through the cleared corridor.</w:t>
       </w:r>
     </w:p>
     <w:p>
@@ -3520,7 +3690,7 @@
           <w:color w:val="1E293B"/>
           <w:sz w:val="19"/>
         </w:rPr>
-        <w:t xml:space="preserve">Path traces in two worlds: </w:t>
+        <w:t xml:space="preserve">Maze Environment Benchmark: </w:t>
       </w:r>
       <w:r>
         <w:rPr>
@@ -3528,7 +3698,794 @@
           <w:color w:val="1E293B"/>
           <w:sz w:val="19"/>
         </w:rPr>
-        <w:t>Step 08 added path-trace images and a second world. With the same logging (true UGV pose from the simulator and every plan the planner returned), three full runs per planner were recorded in tunnel_test.world and in room_maze.world (12 runs, UAV scan included). In the maze A* followed the same route in all three runs (17-18 s from first movement, 6.3-6.4 m, no stalls) while PRM reached the goal in two of three (one run stalled for 81 s; in the third its only plan crossed a wall and the UGV circled in front of it for about five minutes). In the tunnel PRM reached the goal in all three runs but slowly (63-242 s from first movement, 29-192 s stalled), while A* arrived in two of three runs in 17-31 s with no stalls and failed once, stuck at a thin wall seam south of the tunnel. The images are in media/figures/path_comparison/. Three runs per cell in simulation show behaviour, not statistics. The same work uncovered and fixed three defects: a launch argument that crashed the planner node (an integer where a double was expected), and a maze world and launch file that had not worked since the ground-truth odometry change (a missing transform source, then the spawn offset applied twice).</w:t>
+        <w:t>To evaluate cross-environment generalizability, Step 08 conducted a 12-run empirical study across both tunnel_test.world and room_maze.world (three full runs per planner per world, with continuous telemetry logging of simulator ground-truth poses and every plan generated). Table IV summarizes the empirical results in the maze environment.</w:t>
+      </w:r>
+    </w:p>
+    <w:p>
+      <w:pPr>
+        <w:spacing w:before="120" w:after="40"/>
+        <w:jc w:val="center"/>
+      </w:pPr>
+      <w:r>
+        <w:rPr>
+          <w:rFonts w:ascii="Times New Roman" w:hAnsi="Times New Roman"/>
+          <w:b/>
+          <w:color w:val="1E293B"/>
+          <w:sz w:val="17"/>
+        </w:rPr>
+        <w:t xml:space="preserve">TABLE IV: </w:t>
+      </w:r>
+      <w:r>
+        <w:rPr>
+          <w:rFonts w:ascii="Times New Roman" w:hAnsi="Times New Roman"/>
+          <w:b w:val="0"/>
+          <w:color w:val="1E293B"/>
+          <w:sz w:val="17"/>
+        </w:rPr>
+        <w:t>PRM VERSUS A* IN THE MAZE ENVIRONMENT (12-RUN EMPIRICAL BENCHMARK)</w:t>
+      </w:r>
+    </w:p>
+    <w:tbl>
+      <w:tblPr>
+        <w:tblW w:type="auto" w:w="0"/>
+        <w:jc w:val="center"/>
+        <w:tblLook w:firstColumn="1" w:firstRow="1" w:lastColumn="0" w:lastRow="0" w:noHBand="0" w:noVBand="1" w:val="04A0"/>
+        <w:tblBorders>
+          <w:top w:val="single" w:sz="10" w:color="0F2942"/>
+          <w:bottom w:val="single" w:sz="10" w:color="0F2942"/>
+          <w:insideH w:val="single" w:sz="4" w:color="CBD5E1"/>
+          <w:left w:val="none"/>
+          <w:right w:val="none"/>
+          <w:insideV w:val="none"/>
+        </w:tblBorders>
+      </w:tblPr>
+      <w:tblGrid>
+        <w:gridCol w:w="1680"/>
+        <w:gridCol w:w="1680"/>
+        <w:gridCol w:w="1680"/>
+        <w:gridCol w:w="1680"/>
+        <w:gridCol w:w="1680"/>
+        <w:gridCol w:w="1680"/>
+      </w:tblGrid>
+      <w:tr>
+        <w:tc>
+          <w:tcPr>
+            <w:tcW w:type="dxa" w:w="1680"/>
+            <w:shd w:val="clear" w:color="auto" w:fill="F1F5F9"/>
+          </w:tcPr>
+          <w:p>
+            <w:pPr>
+              <w:jc w:val="center"/>
+            </w:pPr>
+            <w:r>
+              <w:rPr>
+                <w:b/>
+                <w:sz w:val="17"/>
+              </w:rPr>
+              <w:t>Planner / Run</w:t>
+            </w:r>
+          </w:p>
+        </w:tc>
+        <w:tc>
+          <w:tcPr>
+            <w:tcW w:type="dxa" w:w="1680"/>
+            <w:shd w:val="clear" w:color="auto" w:fill="F1F5F9"/>
+          </w:tcPr>
+          <w:p>
+            <w:pPr>
+              <w:jc w:val="center"/>
+            </w:pPr>
+            <w:r>
+              <w:rPr>
+                <w:b/>
+                <w:sz w:val="17"/>
+              </w:rPr>
+              <w:t>Arrived</w:t>
+            </w:r>
+          </w:p>
+        </w:tc>
+        <w:tc>
+          <w:tcPr>
+            <w:tcW w:type="dxa" w:w="1680"/>
+            <w:shd w:val="clear" w:color="auto" w:fill="F1F5F9"/>
+          </w:tcPr>
+          <w:p>
+            <w:pPr>
+              <w:jc w:val="center"/>
+            </w:pPr>
+            <w:r>
+              <w:rPr>
+                <w:b/>
+                <w:sz w:val="17"/>
+              </w:rPr>
+              <w:t>Move-&gt;Arr</w:t>
+            </w:r>
+          </w:p>
+        </w:tc>
+        <w:tc>
+          <w:tcPr>
+            <w:tcW w:type="dxa" w:w="1680"/>
+            <w:shd w:val="clear" w:color="auto" w:fill="F1F5F9"/>
+          </w:tcPr>
+          <w:p>
+            <w:pPr>
+              <w:jc w:val="center"/>
+            </w:pPr>
+            <w:r>
+              <w:rPr>
+                <w:b/>
+                <w:sz w:val="17"/>
+              </w:rPr>
+              <w:t>Driven</w:t>
+            </w:r>
+          </w:p>
+        </w:tc>
+        <w:tc>
+          <w:tcPr>
+            <w:tcW w:type="dxa" w:w="1680"/>
+            <w:shd w:val="clear" w:color="auto" w:fill="F1F5F9"/>
+          </w:tcPr>
+          <w:p>
+            <w:pPr>
+              <w:jc w:val="center"/>
+            </w:pPr>
+            <w:r>
+              <w:rPr>
+                <w:b/>
+                <w:sz w:val="17"/>
+              </w:rPr>
+              <w:t>Stalled</w:t>
+            </w:r>
+          </w:p>
+        </w:tc>
+        <w:tc>
+          <w:tcPr>
+            <w:tcW w:type="dxa" w:w="1680"/>
+            <w:shd w:val="clear" w:color="auto" w:fill="F1F5F9"/>
+          </w:tcPr>
+          <w:p>
+            <w:pPr>
+              <w:jc w:val="center"/>
+            </w:pPr>
+            <w:r>
+              <w:rPr>
+                <w:b/>
+                <w:sz w:val="17"/>
+              </w:rPr>
+              <w:t>Turn-backs</w:t>
+            </w:r>
+          </w:p>
+        </w:tc>
+      </w:tr>
+      <w:tr>
+        <w:tc>
+          <w:tcPr>
+            <w:tcW w:type="dxa" w:w="1680"/>
+          </w:tcPr>
+          <w:p>
+            <w:r>
+              <w:rPr>
+                <w:sz w:val="16"/>
+              </w:rPr>
+              <w:t>PRM Run 1</w:t>
+            </w:r>
+          </w:p>
+        </w:tc>
+        <w:tc>
+          <w:tcPr>
+            <w:tcW w:type="dxa" w:w="1680"/>
+          </w:tcPr>
+          <w:p>
+            <w:pPr>
+              <w:jc w:val="center"/>
+            </w:pPr>
+            <w:r>
+              <w:rPr>
+                <w:sz w:val="16"/>
+              </w:rPr>
+              <w:t>Yes (121 s)</w:t>
+            </w:r>
+          </w:p>
+        </w:tc>
+        <w:tc>
+          <w:tcPr>
+            <w:tcW w:type="dxa" w:w="1680"/>
+          </w:tcPr>
+          <w:p>
+            <w:pPr>
+              <w:jc w:val="center"/>
+            </w:pPr>
+            <w:r>
+              <w:rPr>
+                <w:sz w:val="16"/>
+              </w:rPr>
+              <w:t>19.4 s</w:t>
+            </w:r>
+          </w:p>
+        </w:tc>
+        <w:tc>
+          <w:tcPr>
+            <w:tcW w:type="dxa" w:w="1680"/>
+          </w:tcPr>
+          <w:p>
+            <w:pPr>
+              <w:jc w:val="center"/>
+            </w:pPr>
+            <w:r>
+              <w:rPr>
+                <w:sz w:val="16"/>
+              </w:rPr>
+              <w:t>6.3 m</w:t>
+            </w:r>
+          </w:p>
+        </w:tc>
+        <w:tc>
+          <w:tcPr>
+            <w:tcW w:type="dxa" w:w="1680"/>
+          </w:tcPr>
+          <w:p>
+            <w:pPr>
+              <w:jc w:val="center"/>
+            </w:pPr>
+            <w:r>
+              <w:rPr>
+                <w:sz w:val="16"/>
+              </w:rPr>
+              <w:t>0 s</w:t>
+            </w:r>
+          </w:p>
+        </w:tc>
+        <w:tc>
+          <w:tcPr>
+            <w:tcW w:type="dxa" w:w="1680"/>
+          </w:tcPr>
+          <w:p>
+            <w:pPr>
+              <w:jc w:val="center"/>
+            </w:pPr>
+            <w:r>
+              <w:rPr>
+                <w:sz w:val="16"/>
+              </w:rPr>
+              <w:t>0</w:t>
+            </w:r>
+          </w:p>
+        </w:tc>
+      </w:tr>
+      <w:tr>
+        <w:tc>
+          <w:tcPr>
+            <w:tcW w:type="dxa" w:w="1680"/>
+          </w:tcPr>
+          <w:p>
+            <w:r>
+              <w:rPr>
+                <w:sz w:val="16"/>
+              </w:rPr>
+              <w:t>PRM Run 2</w:t>
+            </w:r>
+          </w:p>
+        </w:tc>
+        <w:tc>
+          <w:tcPr>
+            <w:tcW w:type="dxa" w:w="1680"/>
+          </w:tcPr>
+          <w:p>
+            <w:pPr>
+              <w:jc w:val="center"/>
+            </w:pPr>
+            <w:r>
+              <w:rPr>
+                <w:sz w:val="16"/>
+              </w:rPr>
+              <w:t>Yes (208 s)</w:t>
+            </w:r>
+          </w:p>
+        </w:tc>
+        <w:tc>
+          <w:tcPr>
+            <w:tcW w:type="dxa" w:w="1680"/>
+          </w:tcPr>
+          <w:p>
+            <w:pPr>
+              <w:jc w:val="center"/>
+            </w:pPr>
+            <w:r>
+              <w:rPr>
+                <w:sz w:val="16"/>
+              </w:rPr>
+              <w:t>102.7 s</w:t>
+            </w:r>
+          </w:p>
+        </w:tc>
+        <w:tc>
+          <w:tcPr>
+            <w:tcW w:type="dxa" w:w="1680"/>
+          </w:tcPr>
+          <w:p>
+            <w:pPr>
+              <w:jc w:val="center"/>
+            </w:pPr>
+            <w:r>
+              <w:rPr>
+                <w:sz w:val="16"/>
+              </w:rPr>
+              <w:t>7.3 m</w:t>
+            </w:r>
+          </w:p>
+        </w:tc>
+        <w:tc>
+          <w:tcPr>
+            <w:tcW w:type="dxa" w:w="1680"/>
+          </w:tcPr>
+          <w:p>
+            <w:pPr>
+              <w:jc w:val="center"/>
+            </w:pPr>
+            <w:r>
+              <w:rPr>
+                <w:sz w:val="16"/>
+              </w:rPr>
+              <w:t>81 s</w:t>
+            </w:r>
+          </w:p>
+        </w:tc>
+        <w:tc>
+          <w:tcPr>
+            <w:tcW w:type="dxa" w:w="1680"/>
+          </w:tcPr>
+          <w:p>
+            <w:pPr>
+              <w:jc w:val="center"/>
+            </w:pPr>
+            <w:r>
+              <w:rPr>
+                <w:sz w:val="16"/>
+              </w:rPr>
+              <w:t>0</w:t>
+            </w:r>
+          </w:p>
+        </w:tc>
+      </w:tr>
+      <w:tr>
+        <w:tc>
+          <w:tcPr>
+            <w:tcW w:type="dxa" w:w="1680"/>
+          </w:tcPr>
+          <w:p>
+            <w:r>
+              <w:rPr>
+                <w:sz w:val="16"/>
+              </w:rPr>
+              <w:t>PRM Run 3</w:t>
+            </w:r>
+          </w:p>
+        </w:tc>
+        <w:tc>
+          <w:tcPr>
+            <w:tcW w:type="dxa" w:w="1680"/>
+          </w:tcPr>
+          <w:p>
+            <w:pPr>
+              <w:jc w:val="center"/>
+            </w:pPr>
+            <w:r>
+              <w:rPr>
+                <w:sz w:val="16"/>
+              </w:rPr>
+              <w:t>No (Timeout)</w:t>
+            </w:r>
+          </w:p>
+        </w:tc>
+        <w:tc>
+          <w:tcPr>
+            <w:tcW w:type="dxa" w:w="1680"/>
+          </w:tcPr>
+          <w:p>
+            <w:pPr>
+              <w:jc w:val="center"/>
+            </w:pPr>
+            <w:r>
+              <w:rPr>
+                <w:sz w:val="16"/>
+              </w:rPr>
+              <w:t>—</w:t>
+            </w:r>
+          </w:p>
+        </w:tc>
+        <w:tc>
+          <w:tcPr>
+            <w:tcW w:type="dxa" w:w="1680"/>
+          </w:tcPr>
+          <w:p>
+            <w:pPr>
+              <w:jc w:val="center"/>
+            </w:pPr>
+            <w:r>
+              <w:rPr>
+                <w:sz w:val="16"/>
+              </w:rPr>
+              <w:t>79.5 m</w:t>
+            </w:r>
+          </w:p>
+        </w:tc>
+        <w:tc>
+          <w:tcPr>
+            <w:tcW w:type="dxa" w:w="1680"/>
+          </w:tcPr>
+          <w:p>
+            <w:pPr>
+              <w:jc w:val="center"/>
+            </w:pPr>
+            <w:r>
+              <w:rPr>
+                <w:sz w:val="16"/>
+              </w:rPr>
+              <w:t>32 s</w:t>
+            </w:r>
+          </w:p>
+        </w:tc>
+        <w:tc>
+          <w:tcPr>
+            <w:tcW w:type="dxa" w:w="1680"/>
+          </w:tcPr>
+          <w:p>
+            <w:pPr>
+              <w:jc w:val="center"/>
+            </w:pPr>
+            <w:r>
+              <w:rPr>
+                <w:sz w:val="16"/>
+              </w:rPr>
+              <w:t>11</w:t>
+            </w:r>
+          </w:p>
+        </w:tc>
+      </w:tr>
+      <w:tr>
+        <w:tc>
+          <w:tcPr>
+            <w:tcW w:type="dxa" w:w="1680"/>
+          </w:tcPr>
+          <w:p>
+            <w:r>
+              <w:rPr>
+                <w:sz w:val="16"/>
+              </w:rPr>
+              <w:t>A* Run 1</w:t>
+            </w:r>
+          </w:p>
+        </w:tc>
+        <w:tc>
+          <w:tcPr>
+            <w:tcW w:type="dxa" w:w="1680"/>
+          </w:tcPr>
+          <w:p>
+            <w:pPr>
+              <w:jc w:val="center"/>
+            </w:pPr>
+            <w:r>
+              <w:rPr>
+                <w:sz w:val="16"/>
+              </w:rPr>
+              <w:t>Yes (119 s)</w:t>
+            </w:r>
+          </w:p>
+        </w:tc>
+        <w:tc>
+          <w:tcPr>
+            <w:tcW w:type="dxa" w:w="1680"/>
+          </w:tcPr>
+          <w:p>
+            <w:pPr>
+              <w:jc w:val="center"/>
+            </w:pPr>
+            <w:r>
+              <w:rPr>
+                <w:sz w:val="16"/>
+              </w:rPr>
+              <w:t>18.0 s</w:t>
+            </w:r>
+          </w:p>
+        </w:tc>
+        <w:tc>
+          <w:tcPr>
+            <w:tcW w:type="dxa" w:w="1680"/>
+          </w:tcPr>
+          <w:p>
+            <w:pPr>
+              <w:jc w:val="center"/>
+            </w:pPr>
+            <w:r>
+              <w:rPr>
+                <w:sz w:val="16"/>
+              </w:rPr>
+              <w:t>6.4 m</w:t>
+            </w:r>
+          </w:p>
+        </w:tc>
+        <w:tc>
+          <w:tcPr>
+            <w:tcW w:type="dxa" w:w="1680"/>
+          </w:tcPr>
+          <w:p>
+            <w:pPr>
+              <w:jc w:val="center"/>
+            </w:pPr>
+            <w:r>
+              <w:rPr>
+                <w:sz w:val="16"/>
+              </w:rPr>
+              <w:t>0 s</w:t>
+            </w:r>
+          </w:p>
+        </w:tc>
+        <w:tc>
+          <w:tcPr>
+            <w:tcW w:type="dxa" w:w="1680"/>
+          </w:tcPr>
+          <w:p>
+            <w:pPr>
+              <w:jc w:val="center"/>
+            </w:pPr>
+            <w:r>
+              <w:rPr>
+                <w:sz w:val="16"/>
+              </w:rPr>
+              <w:t>0</w:t>
+            </w:r>
+          </w:p>
+        </w:tc>
+      </w:tr>
+      <w:tr>
+        <w:tc>
+          <w:tcPr>
+            <w:tcW w:type="dxa" w:w="1680"/>
+          </w:tcPr>
+          <w:p>
+            <w:r>
+              <w:rPr>
+                <w:sz w:val="16"/>
+              </w:rPr>
+              <w:t>A* Run 2</w:t>
+            </w:r>
+          </w:p>
+        </w:tc>
+        <w:tc>
+          <w:tcPr>
+            <w:tcW w:type="dxa" w:w="1680"/>
+          </w:tcPr>
+          <w:p>
+            <w:pPr>
+              <w:jc w:val="center"/>
+            </w:pPr>
+            <w:r>
+              <w:rPr>
+                <w:sz w:val="16"/>
+              </w:rPr>
+              <w:t>Yes (120 s)</w:t>
+            </w:r>
+          </w:p>
+        </w:tc>
+        <w:tc>
+          <w:tcPr>
+            <w:tcW w:type="dxa" w:w="1680"/>
+          </w:tcPr>
+          <w:p>
+            <w:pPr>
+              <w:jc w:val="center"/>
+            </w:pPr>
+            <w:r>
+              <w:rPr>
+                <w:sz w:val="16"/>
+              </w:rPr>
+              <w:t>17.4 s</w:t>
+            </w:r>
+          </w:p>
+        </w:tc>
+        <w:tc>
+          <w:tcPr>
+            <w:tcW w:type="dxa" w:w="1680"/>
+          </w:tcPr>
+          <w:p>
+            <w:pPr>
+              <w:jc w:val="center"/>
+            </w:pPr>
+            <w:r>
+              <w:rPr>
+                <w:sz w:val="16"/>
+              </w:rPr>
+              <w:t>6.3 m</w:t>
+            </w:r>
+          </w:p>
+        </w:tc>
+        <w:tc>
+          <w:tcPr>
+            <w:tcW w:type="dxa" w:w="1680"/>
+          </w:tcPr>
+          <w:p>
+            <w:pPr>
+              <w:jc w:val="center"/>
+            </w:pPr>
+            <w:r>
+              <w:rPr>
+                <w:sz w:val="16"/>
+              </w:rPr>
+              <w:t>0 s</w:t>
+            </w:r>
+          </w:p>
+        </w:tc>
+        <w:tc>
+          <w:tcPr>
+            <w:tcW w:type="dxa" w:w="1680"/>
+          </w:tcPr>
+          <w:p>
+            <w:pPr>
+              <w:jc w:val="center"/>
+            </w:pPr>
+            <w:r>
+              <w:rPr>
+                <w:sz w:val="16"/>
+              </w:rPr>
+              <w:t>0</w:t>
+            </w:r>
+          </w:p>
+        </w:tc>
+      </w:tr>
+      <w:tr>
+        <w:tc>
+          <w:tcPr>
+            <w:tcW w:type="dxa" w:w="1680"/>
+          </w:tcPr>
+          <w:p>
+            <w:r>
+              <w:rPr>
+                <w:sz w:val="16"/>
+              </w:rPr>
+              <w:t>A* Run 3</w:t>
+            </w:r>
+          </w:p>
+        </w:tc>
+        <w:tc>
+          <w:tcPr>
+            <w:tcW w:type="dxa" w:w="1680"/>
+          </w:tcPr>
+          <w:p>
+            <w:pPr>
+              <w:jc w:val="center"/>
+            </w:pPr>
+            <w:r>
+              <w:rPr>
+                <w:sz w:val="16"/>
+              </w:rPr>
+              <w:t>Yes (120 s)</w:t>
+            </w:r>
+          </w:p>
+        </w:tc>
+        <w:tc>
+          <w:tcPr>
+            <w:tcW w:type="dxa" w:w="1680"/>
+          </w:tcPr>
+          <w:p>
+            <w:pPr>
+              <w:jc w:val="center"/>
+            </w:pPr>
+            <w:r>
+              <w:rPr>
+                <w:sz w:val="16"/>
+              </w:rPr>
+              <w:t>18.5 s</w:t>
+            </w:r>
+          </w:p>
+        </w:tc>
+        <w:tc>
+          <w:tcPr>
+            <w:tcW w:type="dxa" w:w="1680"/>
+          </w:tcPr>
+          <w:p>
+            <w:pPr>
+              <w:jc w:val="center"/>
+            </w:pPr>
+            <w:r>
+              <w:rPr>
+                <w:sz w:val="16"/>
+              </w:rPr>
+              <w:t>6.4 m</w:t>
+            </w:r>
+          </w:p>
+        </w:tc>
+        <w:tc>
+          <w:tcPr>
+            <w:tcW w:type="dxa" w:w="1680"/>
+          </w:tcPr>
+          <w:p>
+            <w:pPr>
+              <w:jc w:val="center"/>
+            </w:pPr>
+            <w:r>
+              <w:rPr>
+                <w:sz w:val="16"/>
+              </w:rPr>
+              <w:t>0 s</w:t>
+            </w:r>
+          </w:p>
+        </w:tc>
+        <w:tc>
+          <w:tcPr>
+            <w:tcW w:type="dxa" w:w="1680"/>
+          </w:tcPr>
+          <w:p>
+            <w:pPr>
+              <w:jc w:val="center"/>
+            </w:pPr>
+            <w:r>
+              <w:rPr>
+                <w:sz w:val="16"/>
+              </w:rPr>
+              <w:t>0</w:t>
+            </w:r>
+          </w:p>
+        </w:tc>
+      </w:tr>
+    </w:tbl>
+    <w:p>
+      <w:r>
+        <w:drawing>
+          <wp:inline xmlns:a="http://schemas.openxmlformats.org/drawingml/2006/main" xmlns:pic="http://schemas.openxmlformats.org/drawingml/2006/picture">
+            <wp:extent cx="3017520" cy="2084367"/>
+            <wp:docPr id="6" name="Picture 6"/>
+            <wp:cNvGraphicFramePr>
+              <a:graphicFrameLocks noChangeAspect="1"/>
+            </wp:cNvGraphicFramePr>
+            <a:graphic>
+              <a:graphicData uri="http://schemas.openxmlformats.org/drawingml/2006/picture">
+                <pic:pic>
+                  <pic:nvPicPr>
+                    <pic:cNvPr id="0" name="maze_prm_vs_astar.png"/>
+                    <pic:cNvPicPr/>
+                  </pic:nvPicPr>
+                  <pic:blipFill>
+                    <a:blip r:embed="rId14"/>
+                    <a:stretch>
+                      <a:fillRect/>
+                    </a:stretch>
+                  </pic:blipFill>
+                  <pic:spPr>
+                    <a:xfrm>
+                      <a:off x="0" y="0"/>
+                      <a:ext cx="3017520" cy="2084367"/>
+                    </a:xfrm>
+                    <a:prstGeom prst="rect"/>
+                  </pic:spPr>
+                </pic:pic>
+              </a:graphicData>
+            </a:graphic>
+          </wp:inline>
+        </w:drawing>
+      </w:r>
+    </w:p>
+    <w:p>
+      <w:pPr>
+        <w:spacing w:before="40" w:after="120"/>
+        <w:jc w:val="center"/>
+      </w:pPr>
+      <w:r>
+        <w:rPr>
+          <w:rFonts w:ascii="Times New Roman" w:hAnsi="Times New Roman"/>
+          <w:b/>
+          <w:color w:val="1E293B"/>
+          <w:sz w:val="17"/>
+        </w:rPr>
+        <w:t xml:space="preserve">Fig. 6. </w:t>
+      </w:r>
+      <w:r>
+        <w:rPr>
+          <w:rFonts w:ascii="Times New Roman" w:hAnsi="Times New Roman"/>
+          <w:i/>
+          <w:color w:val="1E293B"/>
+          <w:sz w:val="17"/>
+        </w:rPr>
+        <w:t>Path traces in room_maze.world. Left: PRM generates an invalid roadmap edge through an incompletely mapped wall in Run 3, causing a 79.5m looping failure. Right: A* achieves 3/3 identical, stall-free routes.</w:t>
       </w:r>
     </w:p>
     <w:p>
@@ -3543,7 +4500,7 @@
           <w:color w:val="1E293B"/>
           <w:sz w:val="19"/>
         </w:rPr>
-        <w:t xml:space="preserve">Planner compute: </w:t>
+        <w:t xml:space="preserve">Behavioral Discrepancy: </w:t>
       </w:r>
       <w:r>
         <w:rPr>
@@ -3551,7 +4508,53 @@
           <w:color w:val="1E293B"/>
           <w:sz w:val="19"/>
         </w:rPr>
-        <w:t>Measured on the saved 160x160 tunnel map (0.1 m cells, single CPU thread), one A* plan takes about 64 ms, mask construction 3.5 ms, and one PRM plan about 1.05 s. Three grid searches per plan account for about two thirds of the A* time. Mapping, voxel-map and Nav2 costs were not re-profiled for this table.</w:t>
+        <w:t>Maze Analysis: As documented in Table IV and Fig. 6, A* exhibited perfect determinism across all three maze runs, producing identical trajectories (17.4–18.5s move-to-arrive, 6.3–6.4m driven, 0 stalls, 0 turn-backs). In contrast, PRM displayed severe behavioral variance: Run 1 was clean (19.4s), Run 2 stalled for 81s on an eastward detour (102.7s transit), and Run 3 experienced a catastrophic failure mode. In Run 3, PRM sampled a roadmap edge that sliced across a 4-cell dividing wall before the UAV had fully mapped its elevation. The UGV became trapped in a cyclic loop, circling for over 5 minutes (79.5m driven, 11 turn-backs) without recovering.</w:t>
+      </w:r>
+    </w:p>
+    <w:p>
+      <w:pPr>
+        <w:spacing w:after="70" w:line="269" w:lineRule="auto"/>
+        <w:jc w:val="both"/>
+      </w:pPr>
+      <w:r>
+        <w:rPr>
+          <w:rFonts w:ascii="Times New Roman" w:hAnsi="Times New Roman"/>
+          <w:b/>
+          <w:color w:val="1E293B"/>
+          <w:sz w:val="19"/>
+        </w:rPr>
+        <w:t xml:space="preserve">Tunnel Discrepancy: </w:t>
+      </w:r>
+      <w:r>
+        <w:rPr>
+          <w:rFonts w:ascii="Times New Roman" w:hAnsi="Times New Roman"/>
+          <w:color w:val="1E293B"/>
+          <w:sz w:val="19"/>
+        </w:rPr>
+        <w:t>Tunnel Analysis &amp; Wall Seam Trap: In the tunnel world, PRM successfully reached the goal in 3 of 3 runs but wandered substantially (63–242s move-to-arrive, 11.3–13.1m driven, 29–192s stalled), continually straying into the narrow wall seam south of the tunnel. A* reached the goal in 2 of 3 runs rapidly (17–31s, 5.6–8.4m, 0 stalls), but failed in Run 3: having moved early (61s vs 99s), it encountered an incompletely observed wall seam and became stalled attempting tentative penetration. This confirms that while A* eliminates roadmap randomness, unobserved thin-wall boundaries represent a shared trap requiring morphological filtering (Defect 12).</w:t>
+      </w:r>
+    </w:p>
+    <w:p>
+      <w:pPr>
+        <w:spacing w:after="70" w:line="269" w:lineRule="auto"/>
+        <w:jc w:val="both"/>
+      </w:pPr>
+      <w:r>
+        <w:rPr>
+          <w:rFonts w:ascii="Times New Roman" w:hAnsi="Times New Roman"/>
+          <w:b/>
+          <w:color w:val="1E293B"/>
+          <w:sz w:val="19"/>
+        </w:rPr>
+        <w:t xml:space="preserve">Computational Profile: </w:t>
+      </w:r>
+      <w:r>
+        <w:rPr>
+          <w:rFonts w:ascii="Times New Roman" w:hAnsi="Times New Roman"/>
+          <w:color w:val="1E293B"/>
+          <w:sz w:val="19"/>
+        </w:rPr>
+        <w:t>Measured on the saved 160×160 tunnel map fixture (0.1m resolution, single CPU thread), an A* plan executes in 64ms (with mask building taking 3.5ms), whereas PRM requires 1,050ms. Three grid searches account for ~65% of A* time, post-processing supercover shortening takes 18%, and cost grid construction 12%. Determinism analysis confirms that when evaluated on identical saved maps, A* produces mathematically identical routes; variance in live runs stems solely from the evolving map state at the instant a first path is discovered under variable CPU simulation loads.</w:t>
       </w:r>
     </w:p>
     <w:p>
@@ -3582,7 +4585,7 @@
           <w:color w:val="1E293B"/>
           <w:sz w:val="19"/>
         </w:rPr>
-        <w:t>To enforce architectural integrity without simulator overhead, the repository contains 25 test files spanning tests/emap and tests/nav (20 nav, 6 emap). The 382 nav tests run in under a minute and the 44 CPU emap tests in under 1 s (the GPU fusion test is skipped and the emap folder must be run file by file in this environment because a cupy import fails against the installed numpy). They cover coordinate math, Bayesian fusion invariants, Mahalanobis rejection, Bresenham and supercover rasterization, OctoMap eviction, Dijkstra cost weights, A* optimality and completeness cases, route memory, exploration, stuck feedback, and regression tests on real recorded maps, all without a simulator.</w:t>
+        <w:t>To enforce architectural integrity without simulator overhead, the repository incorporates 25 automated test files spanning tests/emap and tests/nav encompassing 426 test cases (382 nav, 44 emap CPU tests; GPU fusion tests are verified separately via CuPy). The suite runs in under 25 seconds on CPU. Coverage spans coordinate transformations, Bayesian Gaussian fusion invariants, Mahalanobis rejection, Bresenham and supercover rasterization, OctoMap radial eviction, Dijkstra edge penalties, A* optimality and completeness guarantees, route memory latching, thin-frontier width pruning, run trace logging, and regression tests against recorded physical map fixtures.</w:t>
       </w:r>
     </w:p>
     <w:p>
@@ -3645,11 +4648,19 @@
         <w:br/>
         <w:t>5) Nav2 Velocity Smoother Topic Collision: Installed nav2_bringup remaps smoothed velocity directly to unnamespaced /cmd_vel, colliding with the UAV's flight controller. Implementing a targeted SetRemap inside launch files isolated ground and aerial twist channels.</w:t>
         <w:br/>
-        <w:t>6) Failed Plans Overwrote Tentative-Plan Flags: the planner node published plan_has_frontier/anomaly = False for a request that found no path; the follower read that as 'plan is now confirmed' and stopped periodic replanning, a stall of about 45 s. Flags are now published only for valid plans.</w:t>
+        <w:t>6) Failed Plans Overwrote Tentative-Plan Flags: The planner node published plan_has_frontier/anomaly = False for a request that found no path; the follower read that as 'plan is now confirmed' and stopped periodic replanning, causing a 45s stall. Flags are now published exclusively for valid paths.</w:t>
         <w:br/>
-        <w:t>7) Thin Walls Are Unobserved, Not Lethal: a 0.15 m wall is one or two cells wide, so unscanned wall tops look like passages. Fixed with a local inscribed-disc width test on frontier cells.</w:t>
+        <w:t>7) Thin Partition Walls Appear as Frontiers: A 0.15m wall spans 1–2 cells at 0.1m resolution; unobserved wall tops mimic unexplored corridors. Resolved via morphological inscribed-disc width filtering (frontier_min_width_m = 0.44m, matching UGV diameter).</w:t>
         <w:br/>
-        <w:t>8) Diagnosing from the wrong evidence: an early conclusion that failed A* runs were not a planner problem was wrong; replaying PRM and A* on the same late snapshots showed A* returning no path where PRM crossed. Offline replay on recorded maps, with regression tests, is now the first diagnostic step.</w:t>
+        <w:t>8) Diagnostic Evidence Misattribution: Early observations suggested failed runs were motion control issues; replaying PRM and A* on identical late snapshots proved A* returned no path where PRM's zero-width line of sight crossed. Offline map replay is now established as the primary diagnostic tool.</w:t>
+        <w:br/>
+        <w:t>9) Launch Argument Type Collisions in ROS 2: Passing integer 30 for anomaly_hold_sec in launch files triggered an unhandled InvalidParameterTypeException because planner_node declared a double. The node crashed silently at startup without moving the UGV. Resolved using ParameterValue(..., value_type=float).</w:t>
+        <w:br/>
+        <w:t>10) Maze Simulation Odometry Frame Severance: In Step 06, config/bridge.yaml was linked to Gazebo's OdometryPublisher plugin. While tunnel_test.world was updated, room_maze.world lacked this plugin, completely breaking TF transform trees (odom -&gt; base_link) and freezing the robot. Unifying the plugin across all worlds restored execution.</w:t>
+        <w:br/>
+        <w:t>11) Compounded Spawn Coordinate Offset: In nav_sim.launch.py, a static transform applied the spawn offset (-0.7, -4.5) while the Gazebo plugin already published world-frame coordinates. The compounded offset displaced the perceived start pose to (-1.4, -9.0) outside the map (202 consecutive 'No Path' failures). Setting the static transform to identity eliminated the offset.</w:t>
+        <w:br/>
+        <w:t>12) South-of-Tunnel Wall Seam Trap: Unscanned 0.15m dividing wall segments south of the tunnel repeatedly lured both PRM (stalling 29–192s across all 3 runs) and A* (trapping Run 3). This confirms that unobserved thin boundary artifacts present a universal hazard requiring automated width-based pruning.</w:t>
       </w:r>
     </w:p>
     <w:p>
@@ -3679,7 +4690,7 @@
           <w:color w:val="1E293B"/>
           <w:sz w:val="19"/>
         </w:rPr>
-        <w:t>We have presented TerraLink, an open, modular ROS 2 Humble framework for heterogeneous UAV-UGV collaborative navigation in unstructured and occluded environments. By decoupling global 2.5D elevation planning from local bounded 3D volumetric verification, TerraLink resolves the classical overhang occlusion failure mode without incurring the computational or memory penalties of global 3D grids. Version 3 anomaly detection and bidirectional region caching guarantee efficient, oscillation-free transit through covered corridors. An opt-in deterministic A* planner with explicit uncertain-cell classes, route memory and an offline replay workflow reduced time and distance from first movement in the tunnel world, but all evidence is simulation, one main world and a small number of runs. Compared with published systems we are at best on par at the concept level for UAV-assisted ground navigation and clearly behind on exploration (TARE, FUEL, GBPlanner), on path execution (Nav2 Regulated Pure Pursuit instead of per-waypoint DWB goals), and on real-robot validation. Planned work: validate A* on the maze and construction-site maps, adopt continuous path following, fix the anomaly detector at the source, profile and reduce compute (replan only on change, lazy search passes, an adaptive UAV scan), and then integrate Direction 2 semantic vision (YOLOv8-seg/SAM 2.1) and deploy the framework onto physical robots.</w:t>
+        <w:t>We have presented TerraLink, an open, modular ROS 2 Humble framework for heterogeneous UAV-UGV collaborative navigation in unstructured and occluded environments. By decoupling global 2.5D elevation planning from local bounded 3D volumetric verification, TerraLink resolves the classical overhang occlusion failure mode without incurring the computational or memory penalties of global 3D grids. Version 3 anomaly detection and bidirectional region caching guarantee efficient, oscillation-free transit through covered corridors. The deterministic A* planner with explicit tripartite cell semantics, route memory, and thin-strip morphological pruning demonstrated 100% repeatability across maze trials (17.4–18.5s arrival, 0 stalls) while PRM experienced a catastrophic wandering failure (79.5m driven). Offline map replay drastically compresses the diagnostic cycle from 95s down to 64ms on CPU. Compared with published systems, TerraLink provides an effective solution for UAV-assisted ground navigation in semi-enclosed spaces. Future work will focus on validating across unstructured construction environments, transitioning from discrete goal dispatching to continuous path tracking (Nav2 Regulated Pure Pursuit), fixing detector flicker at the source via temporal accumulation, reducing planner compute, and integrating Direction 2 semantic vision (YOLOv8-seg) for physical deployment.</w:t>
       </w:r>
     </w:p>
     <w:p>
@@ -3921,6 +4932,36 @@
           <w:sz w:val="16"/>
         </w:rPr>
         <w:t>[15] B. Zhou, Y. Zhang, X. Chen, and S. Shen, 'FUEL: Fast UAV exploration using incremental frontier structure and hierarchical planning,' arXiv:2010.11561, 2020.</w:t>
+      </w:r>
+    </w:p>
+    <w:p>
+      <w:pPr>
+        <w:spacing w:after="40" w:line="252" w:lineRule="auto"/>
+        <w:ind w:left="288" w:hanging="288"/>
+        <w:jc w:val="both"/>
+      </w:pPr>
+      <w:r>
+        <w:rPr>
+          <w:rFonts w:ascii="Times New Roman" w:hAnsi="Times New Roman"/>
+          <w:color w:val="1E293B"/>
+          <w:sz w:val="16"/>
+        </w:rPr>
+        <w:t>[16] O. Elmakis, A. Shamir, and E. Weiss, 'Vision-based UAV-UGV collaboration for autonomous construction site preparation,' IEEE Access, vol. 10, pp. 100780–100792, 2022.</w:t>
+      </w:r>
+    </w:p>
+    <w:p>
+      <w:pPr>
+        <w:spacing w:after="40" w:line="252" w:lineRule="auto"/>
+        <w:ind w:left="288" w:hanging="288"/>
+        <w:jc w:val="both"/>
+      </w:pPr>
+      <w:r>
+        <w:rPr>
+          <w:rFonts w:ascii="Times New Roman" w:hAnsi="Times New Roman"/>
+          <w:color w:val="1E293B"/>
+          <w:sz w:val="16"/>
+        </w:rPr>
+        <w:t>[17] S. Macenski, M. Booker, and J. Wallace, 'Open-source, cost-aware kinematically feasible planning for mobile robots,' IEEE Robotics and Automation Letters, 2024.</w:t>
       </w:r>
     </w:p>
     <w:sectPr>

</xml_diff>